<commit_message>
File updated as per the review comments
</commit_message>
<xml_diff>
--- a/docs/LLD/lld_temperature_monitoring_system.docx
+++ b/docs/LLD/lld_temperature_monitoring_system.docx
@@ -7,6 +7,9 @@
         <w:pStyle w:val="Heading1"/>
       </w:pPr>
       <w:r>
+        <w:t xml:space="preserve">Temperature Monitoring System </w:t>
+      </w:r>
+      <w:r>
         <w:t>Low-Level Design (LLD)</w:t>
       </w:r>
     </w:p>
@@ -65,6 +68,103 @@
     <w:p>
       <w:r>
         <w:t>The document provides a low-level design overview for a temperature monitoring system.</w:t>
+      </w:r>
+      <w:r>
+        <w:t xml:space="preserve"> The system will </w:t>
+      </w:r>
+      <w:r>
+        <w:rPr>
+          <w:lang w:val="en-IN"/>
+        </w:rPr>
+        <w:t xml:space="preserve">monitor the temperature </w:t>
+      </w:r>
+      <w:r>
+        <w:rPr>
+          <w:lang w:val="en-IN"/>
+        </w:rPr>
+        <w:t xml:space="preserve">in </w:t>
+      </w:r>
+      <w:proofErr w:type="gramStart"/>
+      <w:r>
+        <w:rPr>
+          <w:lang w:val="en-IN"/>
+        </w:rPr>
+        <w:t>every p</w:t>
+      </w:r>
+      <w:proofErr w:type="gramEnd"/>
+      <w:r>
+        <w:rPr>
+          <w:lang w:val="en-IN"/>
+        </w:rPr>
+        <w:t xml:space="preserve"> second </w:t>
+      </w:r>
+      <w:r>
+        <w:rPr>
+          <w:lang w:val="en-IN"/>
+        </w:rPr>
+        <w:t xml:space="preserve">and </w:t>
+      </w:r>
+      <w:r>
+        <w:rPr>
+          <w:lang w:val="en-IN"/>
+        </w:rPr>
+        <w:t>activate</w:t>
+      </w:r>
+      <w:r>
+        <w:rPr>
+          <w:lang w:val="en-IN"/>
+        </w:rPr>
+        <w:t xml:space="preserve"> an alarm</w:t>
+      </w:r>
+      <w:r>
+        <w:rPr>
+          <w:lang w:val="en-IN"/>
+        </w:rPr>
+        <w:t xml:space="preserve"> for n </w:t>
+      </w:r>
+      <w:proofErr w:type="gramStart"/>
+      <w:r>
+        <w:rPr>
+          <w:lang w:val="en-IN"/>
+        </w:rPr>
+        <w:t>second</w:t>
+      </w:r>
+      <w:proofErr w:type="gramEnd"/>
+      <w:r>
+        <w:rPr>
+          <w:lang w:val="en-IN"/>
+        </w:rPr>
+        <w:t xml:space="preserve"> if the measured temperature goes beyond the preset threshold level</w:t>
+      </w:r>
+      <w:r>
+        <w:rPr>
+          <w:lang w:val="en-IN"/>
+        </w:rPr>
+        <w:t xml:space="preserve"> t</w:t>
+      </w:r>
+      <w:r>
+        <w:rPr>
+          <w:lang w:val="en-IN"/>
+        </w:rPr>
+        <w:t>.</w:t>
+      </w:r>
+      <w:r>
+        <w:rPr>
+          <w:lang w:val="en-IN"/>
+        </w:rPr>
+        <w:t xml:space="preserve"> </w:t>
+      </w:r>
+      <w:r>
+        <w:t xml:space="preserve">It </w:t>
+      </w:r>
+      <w:r>
+        <w:t>gives a detailed view</w:t>
+      </w:r>
+      <w:r>
+        <w:t xml:space="preserve"> on the High-Level Design (HLD</w:t>
+      </w:r>
+      <w:r>
+        <w:t>).</w:t>
       </w:r>
     </w:p>
     <w:p>
@@ -258,7 +358,7 @@
         </w:rPr>
       </w:pPr>
       <w:r>
-        <w:t>s</w:t>
+        <w:t>S</w:t>
       </w:r>
       <w:r>
         <w:t xml:space="preserve">ensor module </w:t>
@@ -272,53 +372,95 @@
           <w:numId w:val="19"/>
         </w:numPr>
         <w:spacing w:after="160" w:line="278" w:lineRule="auto"/>
-      </w:pPr>
-      <w:r>
-        <w:t>uint32 ucTemperatureValue</w:t>
-      </w:r>
+        <w:ind w:left="1080"/>
+      </w:pPr>
+      <w:r>
+        <w:t xml:space="preserve">uint32 </w:t>
+      </w:r>
+      <w:proofErr w:type="spellStart"/>
+      <w:r>
+        <w:t>sensorReadTemperature</w:t>
+      </w:r>
+      <w:proofErr w:type="spellEnd"/>
       <w:r>
         <w:t xml:space="preserve"> </w:t>
       </w:r>
       <w:r>
-        <w:t xml:space="preserve">sensorReadTemperature </w:t>
-      </w:r>
-      <w:r>
         <w:t>(</w:t>
       </w:r>
       <w:r>
-        <w:t>uint8</w:t>
-      </w:r>
-      <w:r>
-        <w:t xml:space="preserve"> </w:t>
-      </w:r>
-      <w:r>
-        <w:t>ucTemperatureSensorPin</w:t>
-      </w:r>
+        <w:t>void</w:t>
+      </w:r>
+      <w:proofErr w:type="gramStart"/>
       <w:r>
         <w:t>)</w:t>
       </w:r>
-    </w:p>
-    <w:p>
-      <w:pPr>
-        <w:spacing w:after="160" w:line="278" w:lineRule="auto"/>
-        <w:ind w:left="1080"/>
-      </w:pPr>
-      <w:r>
-        <w:t xml:space="preserve">         </w:t>
+      <w:r>
+        <w:t>;</w:t>
+      </w:r>
+      <w:r>
+        <w:t xml:space="preserve">   </w:t>
+      </w:r>
+      <w:proofErr w:type="gramEnd"/>
+      <w:r>
+        <w:t xml:space="preserve">      </w:t>
       </w:r>
       <w:r>
         <w:br/>
       </w:r>
       <w:r>
-        <w:t>It will receive the pin to which the sensor is connected as input argument</w:t>
-      </w:r>
-      <w:r>
-        <w:t xml:space="preserve">, the sensor pin is set to be input pin. </w:t>
-      </w:r>
-      <w:r>
-        <w:t>And will return the measured temperature</w:t>
-      </w:r>
-      <w:r>
+        <w:t>It</w:t>
+      </w:r>
+      <w:r>
+        <w:t xml:space="preserve"> will return the measured temperature</w:t>
+      </w:r>
+      <w:r>
+        <w:t>.</w:t>
+      </w:r>
+      <w:r>
+        <w:t xml:space="preserve"> In case if the sensor is not available it will return a </w:t>
+      </w:r>
+      <w:r>
+        <w:t xml:space="preserve">random value </w:t>
+      </w:r>
+      <w:proofErr w:type="gramStart"/>
+      <w:r>
+        <w:t>with in</w:t>
+      </w:r>
+      <w:proofErr w:type="gramEnd"/>
+      <w:r>
+        <w:t xml:space="preserve"> the range of sensor output level </w:t>
+      </w:r>
+      <w:proofErr w:type="spellStart"/>
+      <w:r>
+        <w:rPr>
+          <w:i/>
+          <w:iCs/>
+        </w:rPr>
+        <w:t>Rmin</w:t>
+      </w:r>
+      <w:proofErr w:type="spellEnd"/>
+      <w:r>
+        <w:rPr>
+          <w:i/>
+          <w:iCs/>
+        </w:rPr>
+        <w:t xml:space="preserve"> and </w:t>
+      </w:r>
+      <w:proofErr w:type="spellStart"/>
+      <w:r>
+        <w:rPr>
+          <w:i/>
+          <w:iCs/>
+        </w:rPr>
+        <w:t>Rmax</w:t>
+      </w:r>
+      <w:proofErr w:type="spellEnd"/>
+      <w:r>
+        <w:rPr>
+          <w:i/>
+          <w:iCs/>
+        </w:rPr>
         <w:t>.</w:t>
       </w:r>
     </w:p>
@@ -347,7 +489,31 @@
           <w:sz w:val="22"/>
           <w:szCs w:val="22"/>
         </w:rPr>
-        <w:t>temperatureMonitoring</w:t>
+        <w:t>T</w:t>
+      </w:r>
+      <w:r>
+        <w:rPr>
+          <w:rFonts w:ascii="Calibri" w:hAnsi="Calibri" w:cs="Calibri"/>
+          <w:sz w:val="22"/>
+          <w:szCs w:val="22"/>
+        </w:rPr>
+        <w:t>emperature</w:t>
+      </w:r>
+      <w:r>
+        <w:rPr>
+          <w:rFonts w:ascii="Calibri" w:hAnsi="Calibri" w:cs="Calibri"/>
+          <w:sz w:val="22"/>
+          <w:szCs w:val="22"/>
+        </w:rPr>
+        <w:t xml:space="preserve"> </w:t>
+      </w:r>
+      <w:r>
+        <w:rPr>
+          <w:rFonts w:ascii="Calibri" w:hAnsi="Calibri" w:cs="Calibri"/>
+          <w:sz w:val="22"/>
+          <w:szCs w:val="22"/>
+        </w:rPr>
+        <w:t>Monitoring</w:t>
       </w:r>
       <w:r>
         <w:rPr>
@@ -356,16 +522,7 @@
           <w:szCs w:val="22"/>
           <w:lang w:val="en-US" w:eastAsia="en-US"/>
         </w:rPr>
-        <w:t xml:space="preserve"> </w:t>
-      </w:r>
-      <w:r>
-        <w:rPr>
-          <w:rFonts w:ascii="Calibri" w:hAnsi="Calibri" w:cs="Calibri"/>
-          <w:sz w:val="22"/>
-          <w:szCs w:val="22"/>
-          <w:lang w:val="en-US" w:eastAsia="en-US"/>
-        </w:rPr>
-        <w:t>module</w:t>
+        <w:t xml:space="preserve"> module</w:t>
       </w:r>
     </w:p>
     <w:p>
@@ -373,21 +530,6 @@
         <w:pStyle w:val="NormalWeb"/>
         <w:spacing w:before="0" w:beforeAutospacing="0" w:after="0" w:afterAutospacing="0"/>
         <w:ind w:left="720"/>
-        <w:jc w:val="both"/>
-        <w:rPr>
-          <w:rFonts w:ascii="Calibri" w:hAnsi="Calibri" w:cs="Calibri"/>
-          <w:sz w:val="22"/>
-          <w:szCs w:val="22"/>
-          <w:lang w:val="en-US" w:eastAsia="en-US"/>
-        </w:rPr>
-      </w:pPr>
-    </w:p>
-    <w:p>
-      <w:pPr>
-        <w:pStyle w:val="NormalWeb"/>
-        <w:spacing w:before="0" w:beforeAutospacing="0" w:after="0" w:afterAutospacing="0"/>
-        <w:ind w:left="720"/>
-        <w:jc w:val="both"/>
         <w:rPr>
           <w:rFonts w:ascii="Calibri" w:hAnsi="Calibri" w:cs="Calibri"/>
           <w:sz w:val="22"/>
@@ -439,7 +581,6 @@
         <w:pStyle w:val="NormalWeb"/>
         <w:spacing w:before="0" w:beforeAutospacing="0" w:after="0" w:afterAutospacing="0"/>
         <w:ind w:left="720"/>
-        <w:jc w:val="both"/>
         <w:rPr>
           <w:rFonts w:ascii="Calibri" w:hAnsi="Calibri" w:cs="Calibri"/>
           <w:sz w:val="22"/>
@@ -454,7 +595,7 @@
           <w:szCs w:val="22"/>
           <w:lang w:val="en-US" w:eastAsia="en-US"/>
         </w:rPr>
-        <w:t xml:space="preserve">The measured temperature is stored in a shared memory and used to activate </w:t>
+        <w:t>The measured temperature is stored in a shared memory and used</w:t>
       </w:r>
       <w:r>
         <w:rPr>
@@ -463,7 +604,7 @@
           <w:szCs w:val="22"/>
           <w:lang w:val="en-US" w:eastAsia="en-US"/>
         </w:rPr>
-        <w:t xml:space="preserve">by the </w:t>
+        <w:t xml:space="preserve"> </w:t>
       </w:r>
       <w:r>
         <w:rPr>
@@ -472,7 +613,7 @@
           <w:szCs w:val="22"/>
           <w:lang w:val="en-US" w:eastAsia="en-US"/>
         </w:rPr>
-        <w:t>alarmManager</w:t>
+        <w:t xml:space="preserve">by the </w:t>
       </w:r>
       <w:r>
         <w:rPr>
@@ -481,7 +622,116 @@
           <w:szCs w:val="22"/>
           <w:lang w:val="en-US" w:eastAsia="en-US"/>
         </w:rPr>
-        <w:t xml:space="preserve"> module.</w:t>
+        <w:t>alarm</w:t>
+      </w:r>
+      <w:r>
+        <w:rPr>
+          <w:rFonts w:ascii="Calibri" w:hAnsi="Calibri" w:cs="Calibri"/>
+          <w:sz w:val="22"/>
+          <w:szCs w:val="22"/>
+          <w:lang w:val="en-US" w:eastAsia="en-US"/>
+        </w:rPr>
+        <w:t xml:space="preserve"> m</w:t>
+      </w:r>
+      <w:r>
+        <w:rPr>
+          <w:rFonts w:ascii="Calibri" w:hAnsi="Calibri" w:cs="Calibri"/>
+          <w:sz w:val="22"/>
+          <w:szCs w:val="22"/>
+          <w:lang w:val="en-US" w:eastAsia="en-US"/>
+        </w:rPr>
+        <w:t>anager</w:t>
+      </w:r>
+      <w:r>
+        <w:rPr>
+          <w:rFonts w:ascii="Calibri" w:hAnsi="Calibri" w:cs="Calibri"/>
+          <w:sz w:val="22"/>
+          <w:szCs w:val="22"/>
+          <w:lang w:val="en-US" w:eastAsia="en-US"/>
+        </w:rPr>
+        <w:t xml:space="preserve"> module</w:t>
+      </w:r>
+      <w:r>
+        <w:rPr>
+          <w:rFonts w:ascii="Calibri" w:hAnsi="Calibri" w:cs="Calibri"/>
+          <w:sz w:val="22"/>
+          <w:szCs w:val="22"/>
+          <w:lang w:val="en-US" w:eastAsia="en-US"/>
+        </w:rPr>
+        <w:t xml:space="preserve"> </w:t>
+      </w:r>
+      <w:r>
+        <w:rPr>
+          <w:rFonts w:ascii="Calibri" w:hAnsi="Calibri" w:cs="Calibri"/>
+          <w:sz w:val="22"/>
+          <w:szCs w:val="22"/>
+          <w:lang w:val="en-US" w:eastAsia="en-US"/>
+        </w:rPr>
+        <w:t>to activate</w:t>
+      </w:r>
+      <w:r>
+        <w:rPr>
+          <w:rFonts w:ascii="Calibri" w:hAnsi="Calibri" w:cs="Calibri"/>
+          <w:sz w:val="22"/>
+          <w:szCs w:val="22"/>
+          <w:lang w:val="en-US" w:eastAsia="en-US"/>
+        </w:rPr>
+        <w:t xml:space="preserve"> the alarm accordingly</w:t>
+      </w:r>
+      <w:r>
+        <w:rPr>
+          <w:rFonts w:ascii="Calibri" w:hAnsi="Calibri" w:cs="Calibri"/>
+          <w:sz w:val="22"/>
+          <w:szCs w:val="22"/>
+          <w:lang w:val="en-US" w:eastAsia="en-US"/>
+        </w:rPr>
+        <w:t>.</w:t>
+      </w:r>
+    </w:p>
+    <w:p>
+      <w:pPr>
+        <w:pStyle w:val="NormalWeb"/>
+        <w:spacing w:before="0" w:beforeAutospacing="0" w:after="0" w:afterAutospacing="0"/>
+        <w:ind w:left="720"/>
+        <w:jc w:val="both"/>
+        <w:rPr>
+          <w:rFonts w:ascii="Calibri" w:hAnsi="Calibri" w:cs="Calibri"/>
+          <w:sz w:val="22"/>
+          <w:szCs w:val="22"/>
+          <w:lang w:val="en-US" w:eastAsia="en-US"/>
+        </w:rPr>
+      </w:pPr>
+    </w:p>
+    <w:p>
+      <w:pPr>
+        <w:pStyle w:val="NormalWeb"/>
+        <w:spacing w:before="0" w:beforeAutospacing="0" w:after="0" w:afterAutospacing="0"/>
+        <w:ind w:left="720"/>
+        <w:jc w:val="both"/>
+        <w:rPr>
+          <w:rFonts w:ascii="Calibri" w:hAnsi="Calibri" w:cs="Calibri"/>
+          <w:sz w:val="22"/>
+          <w:szCs w:val="22"/>
+          <w:lang w:val="en-US" w:eastAsia="en-US"/>
+        </w:rPr>
+      </w:pPr>
+      <w:r>
+        <w:rPr>
+          <w:rFonts w:ascii="Calibri" w:hAnsi="Calibri" w:cs="Calibri"/>
+          <w:sz w:val="22"/>
+          <w:szCs w:val="22"/>
+          <w:lang w:val="en-US" w:eastAsia="en-US"/>
+        </w:rPr>
+        <w:t>Subroutines used in the implementation</w:t>
+      </w:r>
+      <w:r>
+        <w:rPr>
+          <w:rFonts w:ascii="Calibri" w:hAnsi="Calibri" w:cs="Calibri"/>
+          <w:sz w:val="22"/>
+          <w:szCs w:val="22"/>
+          <w:lang w:val="en-US" w:eastAsia="en-US"/>
+        </w:rPr>
+        <w:t>:</w:t>
       </w:r>
     </w:p>
     <w:p>
@@ -506,7 +756,7 @@
           <w:numId w:val="19"/>
         </w:numPr>
         <w:spacing w:before="0" w:beforeAutospacing="0" w:after="0" w:afterAutospacing="0"/>
-        <w:jc w:val="both"/>
+        <w:ind w:left="1080"/>
         <w:rPr>
           <w:rFonts w:ascii="Calibri" w:hAnsi="Calibri" w:cs="Calibri"/>
           <w:sz w:val="22"/>
@@ -521,7 +771,7 @@
           <w:szCs w:val="22"/>
           <w:lang w:val="en-US" w:eastAsia="en-US"/>
         </w:rPr>
-        <w:t xml:space="preserve">bool </w:t>
+        <w:t xml:space="preserve">static </w:t>
       </w:r>
       <w:r>
         <w:rPr>
@@ -530,7 +780,7 @@
           <w:szCs w:val="22"/>
           <w:lang w:val="en-US" w:eastAsia="en-US"/>
         </w:rPr>
-        <w:t>temperatureMonitoringUpdateData</w:t>
+        <w:t>bool</w:t>
       </w:r>
       <w:r>
         <w:rPr>
@@ -539,8 +789,9 @@
           <w:szCs w:val="22"/>
           <w:lang w:val="en-US" w:eastAsia="en-US"/>
         </w:rPr>
-        <w:t xml:space="preserve"> (</w:t>
-      </w:r>
+        <w:t xml:space="preserve"> </w:t>
+      </w:r>
+      <w:proofErr w:type="spellStart"/>
       <w:r>
         <w:rPr>
           <w:rFonts w:ascii="Calibri" w:hAnsi="Calibri" w:cs="Calibri"/>
@@ -548,8 +799,9 @@
           <w:szCs w:val="22"/>
           <w:lang w:val="en-US" w:eastAsia="en-US"/>
         </w:rPr>
-        <w:t xml:space="preserve">const </w:t>
-      </w:r>
+        <w:t>temperatureMonitoringUpdateData</w:t>
+      </w:r>
+      <w:proofErr w:type="spellEnd"/>
       <w:r>
         <w:rPr>
           <w:rFonts w:ascii="Calibri" w:hAnsi="Calibri" w:cs="Calibri"/>
@@ -557,22 +809,18 @@
           <w:szCs w:val="22"/>
           <w:lang w:val="en-US" w:eastAsia="en-US"/>
         </w:rPr>
-        <w:t xml:space="preserve">uint8 *pFileName, </w:t>
-      </w:r>
-    </w:p>
-    <w:p>
-      <w:pPr>
-        <w:pStyle w:val="NormalWeb"/>
-        <w:spacing w:before="0" w:beforeAutospacing="0" w:after="0" w:afterAutospacing="0"/>
-        <w:ind w:left="720"/>
-        <w:jc w:val="both"/>
+        <w:t xml:space="preserve"> </w:t>
+      </w:r>
+      <w:r>
         <w:rPr>
           <w:rFonts w:ascii="Calibri" w:hAnsi="Calibri" w:cs="Calibri"/>
           <w:sz w:val="22"/>
           <w:szCs w:val="22"/>
           <w:lang w:val="en-US" w:eastAsia="en-US"/>
         </w:rPr>
-      </w:pPr>
+        <w:t xml:space="preserve">(uint32 </w:t>
+      </w:r>
+      <w:proofErr w:type="spellStart"/>
       <w:r>
         <w:rPr>
           <w:rFonts w:ascii="Calibri" w:hAnsi="Calibri" w:cs="Calibri"/>
@@ -580,8 +828,10 @@
           <w:szCs w:val="22"/>
           <w:lang w:val="en-US" w:eastAsia="en-US"/>
         </w:rPr>
-        <w:t xml:space="preserve">                                                                            </w:t>
-      </w:r>
+        <w:t>ulTemperatureValue</w:t>
+      </w:r>
+      <w:proofErr w:type="spellEnd"/>
+      <w:proofErr w:type="gramStart"/>
       <w:r>
         <w:rPr>
           <w:rFonts w:ascii="Calibri" w:hAnsi="Calibri" w:cs="Calibri"/>
@@ -589,7 +839,7 @@
           <w:szCs w:val="22"/>
           <w:lang w:val="en-US" w:eastAsia="en-US"/>
         </w:rPr>
-        <w:t xml:space="preserve">               </w:t>
+        <w:t>)</w:t>
       </w:r>
       <w:r>
         <w:rPr>
@@ -598,14 +848,15 @@
           <w:szCs w:val="22"/>
           <w:lang w:val="en-US" w:eastAsia="en-US"/>
         </w:rPr>
-        <w:t>uint32 ulTemperatureValue)</w:t>
-      </w:r>
+        <w:t>;</w:t>
+      </w:r>
+      <w:proofErr w:type="gramEnd"/>
     </w:p>
     <w:p>
       <w:pPr>
         <w:pStyle w:val="NormalWeb"/>
         <w:spacing w:before="0" w:beforeAutospacing="0" w:after="0" w:afterAutospacing="0"/>
-        <w:ind w:left="720"/>
+        <w:ind w:left="1080"/>
         <w:jc w:val="both"/>
         <w:rPr>
           <w:rFonts w:ascii="Calibri" w:hAnsi="Calibri" w:cs="Calibri"/>
@@ -619,7 +870,7 @@
       <w:pPr>
         <w:pStyle w:val="NormalWeb"/>
         <w:spacing w:before="0" w:beforeAutospacing="0" w:after="0" w:afterAutospacing="0"/>
-        <w:ind w:left="720"/>
+        <w:ind w:left="1080"/>
         <w:jc w:val="both"/>
         <w:rPr>
           <w:rFonts w:ascii="Calibri" w:hAnsi="Calibri" w:cs="Calibri"/>
@@ -653,7 +904,88 @@
           <w:szCs w:val="22"/>
           <w:lang w:val="en-US" w:eastAsia="en-US"/>
         </w:rPr>
-        <w:t xml:space="preserve"> the current temperature and name of the file to which the temperature is updated</w:t>
+        <w:t xml:space="preserve"> the current </w:t>
+      </w:r>
+      <w:r>
+        <w:rPr>
+          <w:rFonts w:ascii="Calibri" w:hAnsi="Calibri" w:cs="Calibri"/>
+          <w:sz w:val="22"/>
+          <w:szCs w:val="22"/>
+          <w:lang w:val="en-US" w:eastAsia="en-US"/>
+        </w:rPr>
+        <w:t>temperature,</w:t>
+      </w:r>
+      <w:r>
+        <w:rPr>
+          <w:rFonts w:ascii="Calibri" w:hAnsi="Calibri" w:cs="Calibri"/>
+          <w:sz w:val="22"/>
+          <w:szCs w:val="22"/>
+          <w:lang w:val="en-US" w:eastAsia="en-US"/>
+        </w:rPr>
+        <w:t xml:space="preserve"> and </w:t>
+      </w:r>
+      <w:r>
+        <w:rPr>
+          <w:rFonts w:ascii="Calibri" w:hAnsi="Calibri" w:cs="Calibri"/>
+          <w:sz w:val="22"/>
+          <w:szCs w:val="22"/>
+          <w:lang w:val="en-US" w:eastAsia="en-US"/>
+        </w:rPr>
+        <w:t xml:space="preserve">it will update the </w:t>
+      </w:r>
+      <w:r>
+        <w:rPr>
+          <w:rFonts w:ascii="Calibri" w:hAnsi="Calibri" w:cs="Calibri"/>
+          <w:sz w:val="22"/>
+          <w:szCs w:val="22"/>
+          <w:lang w:val="en-US" w:eastAsia="en-US"/>
+        </w:rPr>
+        <w:t>data received</w:t>
+      </w:r>
+      <w:r>
+        <w:rPr>
+          <w:rFonts w:ascii="Calibri" w:hAnsi="Calibri" w:cs="Calibri"/>
+          <w:sz w:val="22"/>
+          <w:szCs w:val="22"/>
+          <w:lang w:val="en-US" w:eastAsia="en-US"/>
+        </w:rPr>
+        <w:t xml:space="preserve"> to the shared</w:t>
+      </w:r>
+      <w:r>
+        <w:rPr>
+          <w:rFonts w:ascii="Calibri" w:hAnsi="Calibri" w:cs="Calibri"/>
+          <w:sz w:val="22"/>
+          <w:szCs w:val="22"/>
+          <w:lang w:val="en-US" w:eastAsia="en-US"/>
+        </w:rPr>
+        <w:t xml:space="preserve"> memory</w:t>
+      </w:r>
+      <w:r>
+        <w:rPr>
+          <w:rFonts w:ascii="Calibri" w:hAnsi="Calibri" w:cs="Calibri"/>
+          <w:sz w:val="22"/>
+          <w:szCs w:val="22"/>
+          <w:lang w:val="en-US" w:eastAsia="en-US"/>
+        </w:rPr>
+        <w:t xml:space="preserve"> to which the temperature is </w:t>
+      </w:r>
+      <w:r>
+        <w:rPr>
+          <w:rFonts w:ascii="Calibri" w:hAnsi="Calibri" w:cs="Calibri"/>
+          <w:sz w:val="22"/>
+          <w:szCs w:val="22"/>
+          <w:lang w:val="en-US" w:eastAsia="en-US"/>
+        </w:rPr>
+        <w:t xml:space="preserve">being </w:t>
+      </w:r>
+      <w:r>
+        <w:rPr>
+          <w:rFonts w:ascii="Calibri" w:hAnsi="Calibri" w:cs="Calibri"/>
+          <w:sz w:val="22"/>
+          <w:szCs w:val="22"/>
+          <w:lang w:val="en-US" w:eastAsia="en-US"/>
+        </w:rPr>
+        <w:t>updated</w:t>
       </w:r>
       <w:r>
         <w:rPr>
@@ -722,14 +1054,25 @@
         <w:rPr>
           <w:rFonts w:cs="Calibri"/>
         </w:rPr>
-        <w:lastRenderedPageBreak/>
-        <w:t>alarmManager</w:t>
+        <w:t>A</w:t>
       </w:r>
       <w:r>
         <w:rPr>
           <w:rFonts w:cs="Calibri"/>
         </w:rPr>
-        <w:t xml:space="preserve"> module</w:t>
+        <w:t>larm</w:t>
+      </w:r>
+      <w:r>
+        <w:rPr>
+          <w:rFonts w:cs="Calibri"/>
+        </w:rPr>
+        <w:t xml:space="preserve"> </w:t>
+      </w:r>
+      <w:r>
+        <w:rPr>
+          <w:rFonts w:cs="Calibri"/>
+        </w:rPr>
+        <w:t>Manager module</w:t>
       </w:r>
     </w:p>
     <w:p>
@@ -752,6 +1095,28 @@
       </w:r>
       <w:r>
         <w:t>to activate the alarm. It will compare the measured temperature with the threshold temperature and if the measured temperature is above the threshold temperature the alarm will be activated for n seconds. If not, no action will be taken.</w:t>
+      </w:r>
+    </w:p>
+    <w:p>
+      <w:pPr>
+        <w:pStyle w:val="ListParagraph"/>
+      </w:pPr>
+    </w:p>
+    <w:p>
+      <w:pPr>
+        <w:pStyle w:val="NormalWeb"/>
+        <w:spacing w:before="0" w:beforeAutospacing="0" w:after="0" w:afterAutospacing="0"/>
+        <w:ind w:left="720"/>
+        <w:jc w:val="both"/>
+      </w:pPr>
+      <w:r>
+        <w:rPr>
+          <w:rFonts w:ascii="Calibri" w:hAnsi="Calibri" w:cs="Calibri"/>
+          <w:sz w:val="22"/>
+          <w:szCs w:val="22"/>
+          <w:lang w:val="en-US" w:eastAsia="en-US"/>
+        </w:rPr>
+        <w:t>Subroutines used in the implementation:</w:t>
       </w:r>
     </w:p>
     <w:p>
@@ -768,29 +1133,41 @@
         </w:numPr>
       </w:pPr>
       <w:r>
+        <w:t xml:space="preserve">static </w:t>
+      </w:r>
+      <w:r>
         <w:t xml:space="preserve">uint32 </w:t>
       </w:r>
+      <w:proofErr w:type="spellStart"/>
       <w:r>
         <w:t>alarmManagerReadData</w:t>
       </w:r>
-      <w:r>
-        <w:t>(const uint8 *pFileName)</w:t>
-      </w:r>
+      <w:proofErr w:type="spellEnd"/>
+      <w:r>
+        <w:t>(</w:t>
+      </w:r>
+      <w:r>
+        <w:t>void</w:t>
+      </w:r>
+      <w:proofErr w:type="gramStart"/>
+      <w:r>
+        <w:t>)</w:t>
+      </w:r>
+      <w:r>
+        <w:t>;</w:t>
+      </w:r>
+      <w:proofErr w:type="gramEnd"/>
     </w:p>
     <w:p>
       <w:pPr>
         <w:pStyle w:val="ListParagraph"/>
-      </w:pPr>
-    </w:p>
-    <w:p>
-      <w:pPr>
-        <w:pStyle w:val="ListParagraph"/>
-      </w:pPr>
-      <w:r>
-        <w:t xml:space="preserve">It reads the updated temperature value from the file mentioned in </w:t>
-      </w:r>
-      <w:r>
-        <w:t>pFileName</w:t>
+        <w:ind w:left="1440"/>
+      </w:pPr>
+      <w:r>
+        <w:t xml:space="preserve">It reads the updated temperature value from the </w:t>
+      </w:r>
+      <w:r>
+        <w:t>shared memory</w:t>
       </w:r>
       <w:r>
         <w:t xml:space="preserve"> and returns the value. Which is then used for comparing with the threshold level.</w:t>
@@ -810,20 +1187,32 @@
         </w:numPr>
       </w:pPr>
       <w:r>
+        <w:t xml:space="preserve">static </w:t>
+      </w:r>
+      <w:r>
         <w:t xml:space="preserve">bool </w:t>
       </w:r>
+      <w:proofErr w:type="spellStart"/>
+      <w:proofErr w:type="gramStart"/>
       <w:r>
         <w:t>alarmManagerCompareData</w:t>
       </w:r>
-      <w:r>
-        <w:t xml:space="preserve">(uint32 </w:t>
-      </w:r>
+      <w:proofErr w:type="spellEnd"/>
+      <w:r>
+        <w:t>(</w:t>
+      </w:r>
+      <w:proofErr w:type="gramEnd"/>
+      <w:r>
+        <w:t xml:space="preserve">uint32 </w:t>
+      </w:r>
+      <w:proofErr w:type="spellStart"/>
       <w:r>
         <w:rPr>
           <w:rFonts w:cs="Calibri"/>
         </w:rPr>
         <w:t>ulTemperatureValue</w:t>
       </w:r>
+      <w:proofErr w:type="spellEnd"/>
       <w:r>
         <w:rPr>
           <w:rFonts w:cs="Calibri"/>
@@ -854,21 +1243,28 @@
         </w:rPr>
         <w:t xml:space="preserve"> </w:t>
       </w:r>
+      <w:proofErr w:type="spellStart"/>
       <w:r>
         <w:rPr>
           <w:rFonts w:cs="Calibri"/>
         </w:rPr>
         <w:t>ulThresholdValue</w:t>
       </w:r>
+      <w:proofErr w:type="spellEnd"/>
+      <w:proofErr w:type="gramStart"/>
       <w:r>
         <w:t>)</w:t>
       </w:r>
+      <w:r>
+        <w:t>;</w:t>
+      </w:r>
+      <w:proofErr w:type="gramEnd"/>
     </w:p>
     <w:p>
       <w:pPr>
         <w:pStyle w:val="NormalWeb"/>
         <w:spacing w:before="0" w:beforeAutospacing="0" w:after="0" w:afterAutospacing="0"/>
-        <w:ind w:left="720"/>
+        <w:ind w:left="1440"/>
         <w:jc w:val="both"/>
         <w:rPr>
           <w:rFonts w:ascii="Calibri" w:hAnsi="Calibri" w:cs="Calibri"/>
@@ -884,8 +1280,9 @@
           <w:szCs w:val="22"/>
           <w:lang w:val="en-US" w:eastAsia="en-US"/>
         </w:rPr>
-        <w:t xml:space="preserve">The function will receive the current temperature and </w:t>
-      </w:r>
+        <w:t xml:space="preserve">The function will receive the current temperature and threshold level. Then it compares both the values and calls </w:t>
+      </w:r>
+      <w:proofErr w:type="spellStart"/>
       <w:r>
         <w:rPr>
           <w:rFonts w:ascii="Calibri" w:hAnsi="Calibri" w:cs="Calibri"/>
@@ -893,8 +1290,9 @@
           <w:szCs w:val="22"/>
           <w:lang w:val="en-US" w:eastAsia="en-US"/>
         </w:rPr>
-        <w:t xml:space="preserve">threshold level. Then it compares both the values and calls </w:t>
-      </w:r>
+        <w:t>alarmManagerAlarmOn</w:t>
+      </w:r>
+      <w:proofErr w:type="spellEnd"/>
       <w:r>
         <w:rPr>
           <w:rFonts w:ascii="Calibri" w:hAnsi="Calibri" w:cs="Calibri"/>
@@ -902,8 +1300,9 @@
           <w:szCs w:val="22"/>
           <w:lang w:val="en-US" w:eastAsia="en-US"/>
         </w:rPr>
-        <w:t>alarmManagerAlarmOn</w:t>
-      </w:r>
+        <w:t xml:space="preserve"> function if </w:t>
+      </w:r>
+      <w:proofErr w:type="spellStart"/>
       <w:r>
         <w:rPr>
           <w:rFonts w:ascii="Calibri" w:hAnsi="Calibri" w:cs="Calibri"/>
@@ -911,8 +1310,9 @@
           <w:szCs w:val="22"/>
           <w:lang w:val="en-US" w:eastAsia="en-US"/>
         </w:rPr>
-        <w:t xml:space="preserve"> function </w:t>
-      </w:r>
+        <w:t>ulTemperatureValue</w:t>
+      </w:r>
+      <w:proofErr w:type="spellEnd"/>
       <w:r>
         <w:rPr>
           <w:rFonts w:ascii="Calibri" w:hAnsi="Calibri" w:cs="Calibri"/>
@@ -920,23 +1320,16 @@
           <w:szCs w:val="22"/>
           <w:lang w:val="en-US" w:eastAsia="en-US"/>
         </w:rPr>
-        <w:t>if ulTemperatureValue</w:t>
-      </w:r>
-      <w:r>
-        <w:rPr>
-          <w:rFonts w:ascii="Calibri" w:hAnsi="Calibri" w:cs="Calibri"/>
-          <w:sz w:val="22"/>
-          <w:szCs w:val="22"/>
-          <w:lang w:val="en-US" w:eastAsia="en-US"/>
-        </w:rPr>
         <w:t xml:space="preserve"> greater than </w:t>
       </w:r>
+      <w:proofErr w:type="spellStart"/>
       <w:r>
         <w:rPr>
           <w:rFonts w:cs="Calibri"/>
         </w:rPr>
         <w:t>ulThresholdValue</w:t>
       </w:r>
+      <w:proofErr w:type="spellEnd"/>
       <w:r>
         <w:rPr>
           <w:rFonts w:ascii="Calibri" w:hAnsi="Calibri" w:cs="Calibri"/>
@@ -993,7 +1386,7 @@
           <w:szCs w:val="22"/>
           <w:lang w:val="en-US" w:eastAsia="en-US"/>
         </w:rPr>
-        <w:t xml:space="preserve">bool </w:t>
+        <w:t xml:space="preserve">static </w:t>
       </w:r>
       <w:r>
         <w:rPr>
@@ -1002,8 +1395,10 @@
           <w:szCs w:val="22"/>
           <w:lang w:val="en-US" w:eastAsia="en-US"/>
         </w:rPr>
-        <w:t>alarmManagerAlarmOn</w:t>
-      </w:r>
+        <w:t xml:space="preserve">bool </w:t>
+      </w:r>
+      <w:proofErr w:type="spellStart"/>
+      <w:proofErr w:type="gramStart"/>
       <w:r>
         <w:rPr>
           <w:rFonts w:ascii="Calibri" w:hAnsi="Calibri" w:cs="Calibri"/>
@@ -1011,8 +1406,59 @@
           <w:szCs w:val="22"/>
           <w:lang w:val="en-US" w:eastAsia="en-US"/>
         </w:rPr>
-        <w:t>(uint8 ucAlarmOnTime)</w:t>
-      </w:r>
+        <w:t>alarmManagerAlarmOn</w:t>
+      </w:r>
+      <w:proofErr w:type="spellEnd"/>
+      <w:r>
+        <w:rPr>
+          <w:rFonts w:ascii="Calibri" w:hAnsi="Calibri" w:cs="Calibri"/>
+          <w:sz w:val="22"/>
+          <w:szCs w:val="22"/>
+          <w:lang w:val="en-US" w:eastAsia="en-US"/>
+        </w:rPr>
+        <w:t>(</w:t>
+      </w:r>
+      <w:proofErr w:type="gramEnd"/>
+      <w:r>
+        <w:rPr>
+          <w:rFonts w:ascii="Calibri" w:hAnsi="Calibri" w:cs="Calibri"/>
+          <w:sz w:val="22"/>
+          <w:szCs w:val="22"/>
+          <w:lang w:val="en-US" w:eastAsia="en-US"/>
+        </w:rPr>
+        <w:t xml:space="preserve">uint8 </w:t>
+      </w:r>
+      <w:proofErr w:type="spellStart"/>
+      <w:r>
+        <w:rPr>
+          <w:rFonts w:ascii="Calibri" w:hAnsi="Calibri" w:cs="Calibri"/>
+          <w:sz w:val="22"/>
+          <w:szCs w:val="22"/>
+          <w:lang w:val="en-US" w:eastAsia="en-US"/>
+        </w:rPr>
+        <w:t>ucAlarmOnTime</w:t>
+      </w:r>
+      <w:proofErr w:type="spellEnd"/>
+      <w:proofErr w:type="gramStart"/>
+      <w:r>
+        <w:rPr>
+          <w:rFonts w:ascii="Calibri" w:hAnsi="Calibri" w:cs="Calibri"/>
+          <w:sz w:val="22"/>
+          <w:szCs w:val="22"/>
+          <w:lang w:val="en-US" w:eastAsia="en-US"/>
+        </w:rPr>
+        <w:t>)</w:t>
+      </w:r>
+      <w:r>
+        <w:rPr>
+          <w:rFonts w:ascii="Calibri" w:hAnsi="Calibri" w:cs="Calibri"/>
+          <w:sz w:val="22"/>
+          <w:szCs w:val="22"/>
+          <w:lang w:val="en-US" w:eastAsia="en-US"/>
+        </w:rPr>
+        <w:t>;</w:t>
+      </w:r>
+      <w:proofErr w:type="gramEnd"/>
     </w:p>
     <w:p>
       <w:pPr>
@@ -1032,7 +1478,7 @@
       <w:pPr>
         <w:pStyle w:val="NormalWeb"/>
         <w:spacing w:before="0" w:beforeAutospacing="0" w:after="0" w:afterAutospacing="0"/>
-        <w:ind w:left="720"/>
+        <w:ind w:left="1440"/>
         <w:jc w:val="both"/>
         <w:rPr>
           <w:rFonts w:ascii="Calibri" w:hAnsi="Calibri" w:cs="Calibri"/>
@@ -1059,6 +1505,7 @@
         </w:rPr>
         <w:t xml:space="preserve">e function will turn on the alarm and then wait for a period of </w:t>
       </w:r>
+      <w:proofErr w:type="spellStart"/>
       <w:r>
         <w:rPr>
           <w:rFonts w:ascii="Calibri" w:hAnsi="Calibri" w:cs="Calibri"/>
@@ -1068,6 +1515,7 @@
         </w:rPr>
         <w:t>ucAlarmOnTime</w:t>
       </w:r>
+      <w:proofErr w:type="spellEnd"/>
       <w:r>
         <w:rPr>
           <w:rFonts w:ascii="Calibri" w:hAnsi="Calibri" w:cs="Calibri"/>
@@ -1077,6 +1525,8 @@
         </w:rPr>
         <w:t xml:space="preserve"> and then invoke the function </w:t>
       </w:r>
+      <w:proofErr w:type="spellStart"/>
+      <w:proofErr w:type="gramStart"/>
       <w:r>
         <w:rPr>
           <w:rFonts w:ascii="Calibri" w:hAnsi="Calibri" w:cs="Calibri"/>
@@ -1093,7 +1543,27 @@
           <w:szCs w:val="22"/>
           <w:lang w:val="en-US" w:eastAsia="en-US"/>
         </w:rPr>
-        <w:t>ff  to turn off the alarm after the wait time.</w:t>
+        <w:t>ff</w:t>
+      </w:r>
+      <w:proofErr w:type="spellEnd"/>
+      <w:r>
+        <w:rPr>
+          <w:rFonts w:ascii="Calibri" w:hAnsi="Calibri" w:cs="Calibri"/>
+          <w:sz w:val="22"/>
+          <w:szCs w:val="22"/>
+          <w:lang w:val="en-US" w:eastAsia="en-US"/>
+        </w:rPr>
+        <w:t xml:space="preserve">  to</w:t>
+      </w:r>
+      <w:proofErr w:type="gramEnd"/>
+      <w:r>
+        <w:rPr>
+          <w:rFonts w:ascii="Calibri" w:hAnsi="Calibri" w:cs="Calibri"/>
+          <w:sz w:val="22"/>
+          <w:szCs w:val="22"/>
+          <w:lang w:val="en-US" w:eastAsia="en-US"/>
+        </w:rPr>
+        <w:t xml:space="preserve"> turn off the alarm after the wait time.</w:t>
       </w:r>
       <w:r>
         <w:rPr>
@@ -1150,6 +1620,7 @@
         </w:rPr>
         <w:t xml:space="preserve">bool </w:t>
       </w:r>
+      <w:proofErr w:type="spellStart"/>
       <w:r>
         <w:rPr>
           <w:rFonts w:ascii="Calibri" w:hAnsi="Calibri" w:cs="Calibri"/>
@@ -1168,6 +1639,7 @@
         </w:rPr>
         <w:t>ff</w:t>
       </w:r>
+      <w:proofErr w:type="spellEnd"/>
       <w:r>
         <w:rPr>
           <w:rFonts w:ascii="Calibri" w:hAnsi="Calibri" w:cs="Calibri"/>
@@ -1214,7 +1686,7 @@
       <w:pPr>
         <w:pStyle w:val="NormalWeb"/>
         <w:spacing w:before="0" w:beforeAutospacing="0" w:after="0" w:afterAutospacing="0"/>
-        <w:ind w:left="720"/>
+        <w:ind w:left="1440"/>
         <w:jc w:val="both"/>
       </w:pPr>
       <w:r>
@@ -1262,7 +1734,10 @@
         </w:rPr>
       </w:pPr>
       <w:r>
-        <w:t xml:space="preserve">sensor module </w:t>
+        <w:t>S</w:t>
+      </w:r>
+      <w:r>
+        <w:t xml:space="preserve">ensor module </w:t>
       </w:r>
     </w:p>
     <w:p>
@@ -1271,98 +1746,143 @@
         <w:ind w:firstLine="720"/>
       </w:pPr>
       <w:r>
-        <w:t>uint32 ucTemperatureValue</w:t>
-      </w:r>
+        <w:t xml:space="preserve">uint32 </w:t>
+      </w:r>
+      <w:proofErr w:type="spellStart"/>
+      <w:r>
+        <w:t>sensorReadTemperature</w:t>
+      </w:r>
+      <w:proofErr w:type="spellEnd"/>
       <w:r>
         <w:t xml:space="preserve"> </w:t>
       </w:r>
       <w:r>
-        <w:t xml:space="preserve">sensorReadTemperature </w:t>
-      </w:r>
-      <w:r>
         <w:t>(</w:t>
       </w:r>
       <w:r>
-        <w:t>uint8</w:t>
-      </w:r>
-      <w:r>
-        <w:t xml:space="preserve"> </w:t>
-      </w:r>
-      <w:r>
-        <w:t>ucTemperatureSensorPin</w:t>
-      </w:r>
+        <w:t>void</w:t>
+      </w:r>
+      <w:proofErr w:type="gramStart"/>
       <w:r>
         <w:t>)</w:t>
       </w:r>
+      <w:r>
+        <w:t>;</w:t>
+      </w:r>
+      <w:proofErr w:type="gramEnd"/>
     </w:p>
     <w:p>
       <w:pPr>
+        <w:pStyle w:val="ListParagraph"/>
+        <w:numPr>
+          <w:ilvl w:val="0"/>
+          <w:numId w:val="18"/>
+        </w:numPr>
         <w:spacing w:after="160" w:line="278" w:lineRule="auto"/>
-        <w:ind w:firstLine="720"/>
-      </w:pPr>
-      <w:r>
-        <w:t>{</w:t>
+      </w:pPr>
+      <w:r>
+        <w:t xml:space="preserve">If the sensor is not available to read the </w:t>
+      </w:r>
+      <w:proofErr w:type="gramStart"/>
+      <w:r>
+        <w:t>temperature</w:t>
+      </w:r>
+      <w:proofErr w:type="gramEnd"/>
+      <w:r>
+        <w:t xml:space="preserve"> then </w:t>
+      </w:r>
+      <w:r>
+        <w:t xml:space="preserve">return a random value </w:t>
+      </w:r>
+      <w:proofErr w:type="gramStart"/>
+      <w:r>
+        <w:t>with in</w:t>
+      </w:r>
+      <w:proofErr w:type="gramEnd"/>
+      <w:r>
+        <w:t xml:space="preserve"> the range of sensor output level </w:t>
+      </w:r>
+      <w:proofErr w:type="spellStart"/>
+      <w:r>
+        <w:rPr>
+          <w:i/>
+          <w:iCs/>
+        </w:rPr>
+        <w:t>Rmin</w:t>
+      </w:r>
+      <w:proofErr w:type="spellEnd"/>
+      <w:r>
+        <w:rPr>
+          <w:i/>
+          <w:iCs/>
+        </w:rPr>
+        <w:t xml:space="preserve"> and </w:t>
+      </w:r>
+      <w:proofErr w:type="spellStart"/>
+      <w:r>
+        <w:rPr>
+          <w:i/>
+          <w:iCs/>
+        </w:rPr>
+        <w:t>Rmax</w:t>
+      </w:r>
+      <w:proofErr w:type="spellEnd"/>
+      <w:r>
+        <w:rPr>
+          <w:i/>
+          <w:iCs/>
+        </w:rPr>
+        <w:t>.</w:t>
       </w:r>
     </w:p>
     <w:p>
       <w:pPr>
-        <w:spacing w:after="160" w:line="278" w:lineRule="auto"/>
-        <w:ind w:firstLine="720"/>
-      </w:pPr>
-      <w:r>
-        <w:tab/>
-        <w:t xml:space="preserve">//set </w:t>
-      </w:r>
-      <w:r>
-        <w:t>ucTemperatureSensorPin</w:t>
-      </w:r>
-      <w:r>
-        <w:t xml:space="preserve"> as input</w:t>
-      </w:r>
+        <w:pStyle w:val="NormalWeb"/>
+        <w:spacing w:before="0" w:beforeAutospacing="0" w:after="0" w:afterAutospacing="0"/>
+        <w:ind w:left="720"/>
+        <w:jc w:val="both"/>
+        <w:rPr>
+          <w:rFonts w:ascii="Calibri" w:hAnsi="Calibri" w:cs="Calibri"/>
+          <w:sz w:val="22"/>
+          <w:szCs w:val="22"/>
+          <w:lang w:val="en-US" w:eastAsia="en-US"/>
+        </w:rPr>
+      </w:pPr>
     </w:p>
     <w:p>
       <w:pPr>
-        <w:spacing w:after="160" w:line="278" w:lineRule="auto"/>
-        <w:ind w:firstLine="720"/>
-      </w:pPr>
-      <w:r>
-        <w:tab/>
-        <w:t>//read sensor value</w:t>
-      </w:r>
+        <w:pStyle w:val="NormalWeb"/>
+        <w:spacing w:before="0" w:beforeAutospacing="0" w:after="0" w:afterAutospacing="0"/>
+        <w:ind w:left="720"/>
+        <w:jc w:val="both"/>
+        <w:rPr>
+          <w:rFonts w:ascii="Calibri" w:hAnsi="Calibri" w:cs="Calibri"/>
+          <w:sz w:val="22"/>
+          <w:szCs w:val="22"/>
+          <w:lang w:val="en-US" w:eastAsia="en-US"/>
+        </w:rPr>
+      </w:pPr>
     </w:p>
     <w:p>
       <w:pPr>
-        <w:spacing w:after="160" w:line="278" w:lineRule="auto"/>
-        <w:ind w:firstLine="720"/>
-      </w:pPr>
-      <w:r>
-        <w:tab/>
-        <w:t>//convert sensor value to temperature</w:t>
-      </w:r>
+        <w:pStyle w:val="NormalWeb"/>
+        <w:spacing w:before="0" w:beforeAutospacing="0" w:after="0" w:afterAutospacing="0"/>
+        <w:ind w:left="720"/>
+        <w:jc w:val="both"/>
+        <w:rPr>
+          <w:rFonts w:ascii="Calibri" w:hAnsi="Calibri" w:cs="Calibri"/>
+          <w:sz w:val="22"/>
+          <w:szCs w:val="22"/>
+          <w:lang w:val="en-US" w:eastAsia="en-US"/>
+        </w:rPr>
+      </w:pPr>
     </w:p>
     <w:p>
       <w:pPr>
-        <w:spacing w:after="160" w:line="278" w:lineRule="auto"/>
-        <w:ind w:firstLine="720"/>
-      </w:pPr>
-      <w:r>
-        <w:tab/>
-        <w:t>//return temperature value</w:t>
-      </w:r>
-    </w:p>
-    <w:p>
-      <w:pPr>
-        <w:spacing w:after="160" w:line="278" w:lineRule="auto"/>
-        <w:ind w:firstLine="720"/>
-      </w:pPr>
-      <w:r>
-        <w:t>}</w:t>
-      </w:r>
-    </w:p>
-    <w:p>
-      <w:pPr>
-        <w:spacing w:after="160" w:line="278" w:lineRule="auto"/>
-        <w:ind w:firstLine="720"/>
+        <w:pStyle w:val="NormalWeb"/>
+        <w:spacing w:before="0" w:beforeAutospacing="0" w:after="160" w:afterAutospacing="0" w:line="278" w:lineRule="auto"/>
+        <w:ind w:left="720"/>
+        <w:jc w:val="both"/>
       </w:pPr>
     </w:p>
     <w:p>
@@ -1372,33 +1892,64 @@
           <w:ilvl w:val="0"/>
           <w:numId w:val="11"/>
         </w:numPr>
-        <w:spacing w:before="0" w:beforeAutospacing="0" w:after="0" w:afterAutospacing="0"/>
+        <w:spacing w:before="0" w:beforeAutospacing="0" w:after="160" w:afterAutospacing="0" w:line="278" w:lineRule="auto"/>
         <w:jc w:val="both"/>
+      </w:pPr>
+      <w:r>
+        <w:rPr>
+          <w:rFonts w:ascii="Calibri" w:hAnsi="Calibri" w:cs="Calibri"/>
+          <w:sz w:val="22"/>
+          <w:szCs w:val="22"/>
+        </w:rPr>
+        <w:lastRenderedPageBreak/>
+        <w:t>T</w:t>
+      </w:r>
+      <w:r>
+        <w:rPr>
+          <w:rFonts w:ascii="Calibri" w:hAnsi="Calibri" w:cs="Calibri"/>
+          <w:sz w:val="22"/>
+          <w:szCs w:val="22"/>
+        </w:rPr>
+        <w:t>emperature</w:t>
+      </w:r>
+      <w:r>
+        <w:rPr>
+          <w:rFonts w:ascii="Calibri" w:hAnsi="Calibri" w:cs="Calibri"/>
+          <w:sz w:val="22"/>
+          <w:szCs w:val="22"/>
+        </w:rPr>
+        <w:t xml:space="preserve"> </w:t>
+      </w:r>
+      <w:r>
+        <w:rPr>
+          <w:rFonts w:ascii="Calibri" w:hAnsi="Calibri" w:cs="Calibri"/>
+          <w:sz w:val="22"/>
+          <w:szCs w:val="22"/>
+        </w:rPr>
+        <w:t>Monitoring</w:t>
+      </w:r>
+      <w:r>
         <w:rPr>
           <w:rFonts w:ascii="Calibri" w:hAnsi="Calibri" w:cs="Calibri"/>
           <w:sz w:val="22"/>
           <w:szCs w:val="22"/>
           <w:lang w:val="en-US" w:eastAsia="en-US"/>
         </w:rPr>
-      </w:pPr>
-      <w:r>
-        <w:rPr>
-          <w:rFonts w:ascii="Calibri" w:hAnsi="Calibri" w:cs="Calibri"/>
-          <w:sz w:val="22"/>
-          <w:szCs w:val="22"/>
-        </w:rPr>
-        <w:lastRenderedPageBreak/>
-        <w:t>temperatureMonitoring</w:t>
-      </w:r>
-      <w:r>
+        <w:t xml:space="preserve"> module</w:t>
+      </w:r>
+    </w:p>
+    <w:p>
+      <w:pPr>
+        <w:pStyle w:val="NormalWeb"/>
+        <w:spacing w:before="0" w:beforeAutospacing="0" w:after="0" w:afterAutospacing="0"/>
+        <w:ind w:firstLine="720"/>
         <w:rPr>
           <w:rFonts w:ascii="Calibri" w:hAnsi="Calibri" w:cs="Calibri"/>
           <w:sz w:val="22"/>
           <w:szCs w:val="22"/>
           <w:lang w:val="en-US" w:eastAsia="en-US"/>
         </w:rPr>
-        <w:t xml:space="preserve"> </w:t>
-      </w:r>
+      </w:pPr>
       <w:r>
         <w:rPr>
           <w:rFonts w:ascii="Calibri" w:hAnsi="Calibri" w:cs="Calibri"/>
@@ -1406,27 +1957,17 @@
           <w:szCs w:val="22"/>
           <w:lang w:val="en-US" w:eastAsia="en-US"/>
         </w:rPr>
-        <w:t>module</w:t>
-      </w:r>
-    </w:p>
-    <w:p>
-      <w:pPr>
-        <w:spacing w:after="160" w:line="278" w:lineRule="auto"/>
-      </w:pPr>
-    </w:p>
-    <w:p>
-      <w:pPr>
-        <w:pStyle w:val="NormalWeb"/>
-        <w:spacing w:before="0" w:beforeAutospacing="0" w:after="0" w:afterAutospacing="0"/>
-        <w:ind w:firstLine="720"/>
-        <w:jc w:val="both"/>
+        <w:t xml:space="preserve">static </w:t>
+      </w:r>
+      <w:r>
         <w:rPr>
           <w:rFonts w:ascii="Calibri" w:hAnsi="Calibri" w:cs="Calibri"/>
           <w:sz w:val="22"/>
           <w:szCs w:val="22"/>
           <w:lang w:val="en-US" w:eastAsia="en-US"/>
         </w:rPr>
-      </w:pPr>
+        <w:t>bool</w:t>
+      </w:r>
       <w:r>
         <w:rPr>
           <w:rFonts w:ascii="Calibri" w:hAnsi="Calibri" w:cs="Calibri"/>
@@ -1434,8 +1975,10 @@
           <w:szCs w:val="22"/>
           <w:lang w:val="en-US" w:eastAsia="en-US"/>
         </w:rPr>
-        <w:t xml:space="preserve">bool </w:t>
-      </w:r>
+        <w:t xml:space="preserve"> </w:t>
+      </w:r>
+      <w:proofErr w:type="spellStart"/>
+      <w:proofErr w:type="gramStart"/>
       <w:r>
         <w:rPr>
           <w:rFonts w:ascii="Calibri" w:hAnsi="Calibri" w:cs="Calibri"/>
@@ -1445,6 +1988,7 @@
         </w:rPr>
         <w:t>temperatureMonitoringUpdateData</w:t>
       </w:r>
+      <w:proofErr w:type="spellEnd"/>
       <w:r>
         <w:rPr>
           <w:rFonts w:ascii="Calibri" w:hAnsi="Calibri" w:cs="Calibri"/>
@@ -1452,22 +1996,19 @@
           <w:szCs w:val="22"/>
           <w:lang w:val="en-US" w:eastAsia="en-US"/>
         </w:rPr>
-        <w:t xml:space="preserve"> (const uint8 *pFileName, </w:t>
-      </w:r>
-    </w:p>
-    <w:p>
-      <w:pPr>
-        <w:pStyle w:val="NormalWeb"/>
-        <w:spacing w:before="0" w:beforeAutospacing="0" w:after="0" w:afterAutospacing="0"/>
-        <w:ind w:left="720"/>
-        <w:jc w:val="both"/>
+        <w:t>(</w:t>
+      </w:r>
+      <w:proofErr w:type="gramEnd"/>
+      <w:r>
         <w:rPr>
           <w:rFonts w:ascii="Calibri" w:hAnsi="Calibri" w:cs="Calibri"/>
           <w:sz w:val="22"/>
           <w:szCs w:val="22"/>
           <w:lang w:val="en-US" w:eastAsia="en-US"/>
         </w:rPr>
-      </w:pPr>
+        <w:t xml:space="preserve">uint32 </w:t>
+      </w:r>
+      <w:proofErr w:type="spellStart"/>
       <w:r>
         <w:rPr>
           <w:rFonts w:ascii="Calibri" w:hAnsi="Calibri" w:cs="Calibri"/>
@@ -1475,22 +2016,19 @@
           <w:szCs w:val="22"/>
           <w:lang w:val="en-US" w:eastAsia="en-US"/>
         </w:rPr>
-        <w:t xml:space="preserve">                                                                                           uint32 ulTemperatureValue)</w:t>
-      </w:r>
-    </w:p>
-    <w:p>
-      <w:pPr>
-        <w:pStyle w:val="NormalWeb"/>
-        <w:spacing w:before="0" w:beforeAutospacing="0" w:after="0" w:afterAutospacing="0"/>
-        <w:ind w:left="720"/>
-        <w:jc w:val="both"/>
+        <w:t>ulTemperatureValue</w:t>
+      </w:r>
+      <w:proofErr w:type="spellEnd"/>
+      <w:proofErr w:type="gramStart"/>
+      <w:r>
         <w:rPr>
           <w:rFonts w:ascii="Calibri" w:hAnsi="Calibri" w:cs="Calibri"/>
           <w:sz w:val="22"/>
           <w:szCs w:val="22"/>
           <w:lang w:val="en-US" w:eastAsia="en-US"/>
         </w:rPr>
-      </w:pPr>
+        <w:t>)</w:t>
+      </w:r>
       <w:r>
         <w:rPr>
           <w:rFonts w:ascii="Calibri" w:hAnsi="Calibri" w:cs="Calibri"/>
@@ -1498,14 +2036,15 @@
           <w:szCs w:val="22"/>
           <w:lang w:val="en-US" w:eastAsia="en-US"/>
         </w:rPr>
-        <w:t>{</w:t>
-      </w:r>
+        <w:t>;</w:t>
+      </w:r>
+      <w:proofErr w:type="gramEnd"/>
     </w:p>
     <w:p>
       <w:pPr>
         <w:pStyle w:val="NormalWeb"/>
         <w:spacing w:before="0" w:beforeAutospacing="0" w:after="0" w:afterAutospacing="0"/>
-        <w:ind w:left="1440"/>
+        <w:ind w:firstLine="720"/>
         <w:rPr>
           <w:rFonts w:ascii="Calibri" w:hAnsi="Calibri" w:cs="Calibri"/>
           <w:sz w:val="22"/>
@@ -1513,15 +2052,22 @@
           <w:lang w:val="en-US" w:eastAsia="en-US"/>
         </w:rPr>
       </w:pPr>
-      <w:r>
+    </w:p>
+    <w:p>
+      <w:pPr>
+        <w:pStyle w:val="NormalWeb"/>
+        <w:numPr>
+          <w:ilvl w:val="0"/>
+          <w:numId w:val="18"/>
+        </w:numPr>
+        <w:spacing w:before="0" w:beforeAutospacing="0" w:after="0" w:afterAutospacing="0"/>
         <w:rPr>
           <w:rFonts w:ascii="Calibri" w:hAnsi="Calibri" w:cs="Calibri"/>
           <w:sz w:val="22"/>
           <w:szCs w:val="22"/>
           <w:lang w:val="en-US" w:eastAsia="en-US"/>
         </w:rPr>
-        <w:t xml:space="preserve">//open the file </w:t>
-      </w:r>
+      </w:pPr>
       <w:r>
         <w:rPr>
           <w:rFonts w:ascii="Calibri" w:hAnsi="Calibri" w:cs="Calibri"/>
@@ -1529,16 +2075,49 @@
           <w:szCs w:val="22"/>
           <w:lang w:val="en-US" w:eastAsia="en-US"/>
         </w:rPr>
-        <w:t>pFileName</w:t>
-      </w:r>
-      <w:r>
+        <w:t xml:space="preserve">Call the </w:t>
+      </w:r>
+      <w:proofErr w:type="spellStart"/>
+      <w:r>
+        <w:rPr>
+          <w:rFonts w:ascii="Calibri" w:hAnsi="Calibri" w:cs="Calibri"/>
+          <w:sz w:val="22"/>
+          <w:szCs w:val="22"/>
+        </w:rPr>
+        <w:t>sensorReadTemperature</w:t>
+      </w:r>
+      <w:proofErr w:type="spellEnd"/>
+      <w:r>
+        <w:rPr>
+          <w:rFonts w:ascii="Calibri" w:hAnsi="Calibri" w:cs="Calibri"/>
+          <w:sz w:val="22"/>
+          <w:szCs w:val="22"/>
+        </w:rPr>
+        <w:t xml:space="preserve"> function defined in sensor module to read the current temperature</w:t>
+      </w:r>
+    </w:p>
+    <w:p>
+      <w:pPr>
+        <w:pStyle w:val="NormalWeb"/>
+        <w:numPr>
+          <w:ilvl w:val="0"/>
+          <w:numId w:val="18"/>
+        </w:numPr>
+        <w:spacing w:before="0" w:beforeAutospacing="0" w:after="0" w:afterAutospacing="0"/>
         <w:rPr>
           <w:rFonts w:ascii="Calibri" w:hAnsi="Calibri" w:cs="Calibri"/>
           <w:sz w:val="22"/>
           <w:szCs w:val="22"/>
           <w:lang w:val="en-US" w:eastAsia="en-US"/>
         </w:rPr>
-        <w:t xml:space="preserve"> in write mode and write </w:t>
+      </w:pPr>
+      <w:r>
+        <w:rPr>
+          <w:rFonts w:ascii="Calibri" w:hAnsi="Calibri" w:cs="Calibri"/>
+          <w:sz w:val="22"/>
+          <w:szCs w:val="22"/>
+        </w:rPr>
+        <w:t xml:space="preserve">Update the </w:t>
       </w:r>
       <w:r>
         <w:rPr>
@@ -1547,96 +2126,21 @@
           <w:szCs w:val="22"/>
           <w:lang w:val="en-US" w:eastAsia="en-US"/>
         </w:rPr>
-        <w:t>the value    //</w:t>
-      </w:r>
-      <w:r>
+        <w:t>data received to the shared memory to which the temperature is being updated.</w:t>
+      </w:r>
+    </w:p>
+    <w:p>
+      <w:pPr>
+        <w:pStyle w:val="NormalWeb"/>
+        <w:spacing w:before="0" w:beforeAutospacing="0" w:after="0" w:afterAutospacing="0"/>
+        <w:ind w:firstLine="720"/>
         <w:rPr>
           <w:rFonts w:ascii="Calibri" w:hAnsi="Calibri" w:cs="Calibri"/>
           <w:sz w:val="22"/>
           <w:szCs w:val="22"/>
           <w:lang w:val="en-US" w:eastAsia="en-US"/>
         </w:rPr>
-        <w:t>ulTemperatureValue</w:t>
-      </w:r>
-      <w:r>
-        <w:rPr>
-          <w:rFonts w:ascii="Calibri" w:hAnsi="Calibri" w:cs="Calibri"/>
-          <w:sz w:val="22"/>
-          <w:szCs w:val="22"/>
-          <w:lang w:val="en-US" w:eastAsia="en-US"/>
-        </w:rPr>
-        <w:t xml:space="preserve"> </w:t>
-      </w:r>
-      <w:r>
-        <w:rPr>
-          <w:rFonts w:ascii="Calibri" w:hAnsi="Calibri" w:cs="Calibri"/>
-          <w:sz w:val="22"/>
-          <w:szCs w:val="22"/>
-          <w:lang w:val="en-US" w:eastAsia="en-US"/>
-        </w:rPr>
-        <w:t>to it</w:t>
-      </w:r>
-    </w:p>
-    <w:p>
-      <w:pPr>
-        <w:pStyle w:val="NormalWeb"/>
-        <w:spacing w:before="0" w:beforeAutospacing="0" w:after="0" w:afterAutospacing="0"/>
-        <w:ind w:left="1440"/>
-        <w:jc w:val="both"/>
-        <w:rPr>
-          <w:rFonts w:ascii="Calibri" w:hAnsi="Calibri" w:cs="Calibri"/>
-          <w:sz w:val="22"/>
-          <w:szCs w:val="22"/>
-          <w:lang w:val="en-US" w:eastAsia="en-US"/>
-        </w:rPr>
-      </w:pPr>
-    </w:p>
-    <w:p>
-      <w:pPr>
-        <w:pStyle w:val="NormalWeb"/>
-        <w:spacing w:before="0" w:beforeAutospacing="0" w:after="0" w:afterAutospacing="0"/>
-        <w:ind w:left="720"/>
-        <w:jc w:val="both"/>
-        <w:rPr>
-          <w:rFonts w:ascii="Calibri" w:hAnsi="Calibri" w:cs="Calibri"/>
-          <w:sz w:val="22"/>
-          <w:szCs w:val="22"/>
-          <w:lang w:val="en-US" w:eastAsia="en-US"/>
-        </w:rPr>
-      </w:pPr>
-      <w:r>
-        <w:rPr>
-          <w:rFonts w:ascii="Calibri" w:hAnsi="Calibri" w:cs="Calibri"/>
-          <w:sz w:val="22"/>
-          <w:szCs w:val="22"/>
-          <w:lang w:val="en-US" w:eastAsia="en-US"/>
-        </w:rPr>
-        <w:tab/>
-        <w:t>//return true if value write successfully, else return false</w:t>
-      </w:r>
-    </w:p>
-    <w:p>
-      <w:pPr>
-        <w:pStyle w:val="NormalWeb"/>
-        <w:spacing w:before="0" w:beforeAutospacing="0" w:after="0" w:afterAutospacing="0"/>
-        <w:ind w:left="720"/>
-        <w:jc w:val="both"/>
-        <w:rPr>
-          <w:rFonts w:ascii="Calibri" w:hAnsi="Calibri" w:cs="Calibri"/>
-          <w:sz w:val="22"/>
-          <w:szCs w:val="22"/>
-          <w:lang w:val="en-US" w:eastAsia="en-US"/>
-        </w:rPr>
-      </w:pPr>
-      <w:r>
-        <w:rPr>
-          <w:rFonts w:ascii="Calibri" w:hAnsi="Calibri" w:cs="Calibri"/>
-          <w:sz w:val="22"/>
-          <w:szCs w:val="22"/>
-          <w:lang w:val="en-US" w:eastAsia="en-US"/>
-        </w:rPr>
-        <w:t>}</w:t>
-      </w:r>
+      </w:pPr>
     </w:p>
     <w:p>
       <w:pPr>
@@ -1658,114 +2162,96 @@
           <w:ilvl w:val="0"/>
           <w:numId w:val="11"/>
         </w:numPr>
+      </w:pPr>
+      <w:r>
         <w:rPr>
           <w:rFonts w:cs="Calibri"/>
         </w:rPr>
-      </w:pPr>
+        <w:t>A</w:t>
+      </w:r>
       <w:r>
         <w:rPr>
           <w:rFonts w:cs="Calibri"/>
         </w:rPr>
-        <w:t>alarmManager module</w:t>
+        <w:t>larm</w:t>
+      </w:r>
+      <w:r>
+        <w:rPr>
+          <w:rFonts w:cs="Calibri"/>
+        </w:rPr>
+        <w:t xml:space="preserve"> </w:t>
+      </w:r>
+      <w:r>
+        <w:rPr>
+          <w:rFonts w:cs="Calibri"/>
+        </w:rPr>
+        <w:t>Manager module</w:t>
       </w:r>
     </w:p>
     <w:p>
       <w:pPr>
-        <w:pStyle w:val="ListParagraph"/>
-      </w:pPr>
+        <w:ind w:firstLine="720"/>
+      </w:pPr>
+      <w:r>
+        <w:t xml:space="preserve">static </w:t>
+      </w:r>
+      <w:r>
+        <w:t xml:space="preserve">uint32 </w:t>
+      </w:r>
+      <w:proofErr w:type="spellStart"/>
+      <w:r>
+        <w:t>alarmManagerReadData</w:t>
+      </w:r>
+      <w:proofErr w:type="spellEnd"/>
+      <w:r>
+        <w:t>(</w:t>
+      </w:r>
+      <w:r>
+        <w:t>void</w:t>
+      </w:r>
+      <w:proofErr w:type="gramStart"/>
+      <w:r>
+        <w:t>)</w:t>
+      </w:r>
+      <w:r>
+        <w:t>;</w:t>
+      </w:r>
+      <w:proofErr w:type="gramEnd"/>
     </w:p>
     <w:p>
       <w:pPr>
         <w:pStyle w:val="ListParagraph"/>
         <w:numPr>
           <w:ilvl w:val="0"/>
-          <w:numId w:val="18"/>
+          <w:numId w:val="24"/>
         </w:numPr>
       </w:pPr>
       <w:r>
-        <w:t xml:space="preserve">uint32 </w:t>
-      </w:r>
-      <w:r>
-        <w:t>alarmManagerReadData</w:t>
-      </w:r>
-      <w:r>
-        <w:t>(const uint8 *pFileName)</w:t>
-      </w:r>
-    </w:p>
-    <w:p>
-      <w:pPr>
-        <w:pStyle w:val="ListParagraph"/>
-        <w:ind w:left="1440"/>
-      </w:pPr>
-      <w:r>
-        <w:t>{</w:t>
-      </w:r>
-    </w:p>
-    <w:p>
-      <w:pPr>
-        <w:pStyle w:val="ListParagraph"/>
-        <w:ind w:left="1440"/>
-      </w:pPr>
-      <w:r>
-        <w:tab/>
-        <w:t xml:space="preserve">//read the temperature value from the file </w:t>
-      </w:r>
-      <w:r>
-        <w:t>pFileName</w:t>
-      </w:r>
-    </w:p>
-    <w:p>
-      <w:pPr>
-        <w:pStyle w:val="ListParagraph"/>
-        <w:ind w:left="1440"/>
-      </w:pPr>
-    </w:p>
-    <w:p>
-      <w:pPr>
-        <w:pStyle w:val="ListParagraph"/>
-        <w:ind w:left="1440"/>
-      </w:pPr>
-      <w:r>
-        <w:tab/>
-        <w:t>//return the value which is read from the file</w:t>
-      </w:r>
-    </w:p>
-    <w:p>
-      <w:pPr>
-        <w:pStyle w:val="ListParagraph"/>
-        <w:ind w:left="1440"/>
-      </w:pPr>
-      <w:r>
-        <w:t>}</w:t>
-      </w:r>
-    </w:p>
-    <w:p>
-      <w:pPr>
-        <w:pStyle w:val="ListParagraph"/>
-      </w:pPr>
+        <w:t>R</w:t>
+      </w:r>
+      <w:r>
+        <w:t xml:space="preserve">ead the temperature value from the </w:t>
+      </w:r>
+      <w:r>
+        <w:t>shared memory</w:t>
+      </w:r>
     </w:p>
     <w:p>
       <w:pPr>
         <w:pStyle w:val="ListParagraph"/>
         <w:numPr>
           <w:ilvl w:val="0"/>
-          <w:numId w:val="18"/>
+          <w:numId w:val="24"/>
         </w:numPr>
       </w:pPr>
       <w:r>
-        <w:t xml:space="preserve">bool </w:t>
-      </w:r>
-      <w:r>
-        <w:t>alarmManagerCompareData</w:t>
-      </w:r>
-      <w:r>
-        <w:t xml:space="preserve">(uint32 </w:t>
-      </w:r>
-      <w:r>
-        <w:rPr>
-          <w:rFonts w:cs="Calibri"/>
-        </w:rPr>
-        <w:t xml:space="preserve">ulTemperatureValue, </w:t>
+        <w:t>R</w:t>
+      </w:r>
+      <w:r>
+        <w:t>eturn the temperature</w:t>
+      </w:r>
+      <w:r>
+        <w:t xml:space="preserve"> value read from the shared memory</w:t>
       </w:r>
     </w:p>
     <w:p>
@@ -1773,197 +2259,115 @@
         <w:pStyle w:val="ListParagraph"/>
         <w:ind w:left="1440"/>
       </w:pPr>
-      <w:r>
-        <w:rPr>
-          <w:rFonts w:cs="Calibri"/>
-        </w:rPr>
-        <w:t xml:space="preserve">                                                              uint32 ulThresholdValue</w:t>
-      </w:r>
-      <w:r>
-        <w:t>)</w:t>
-      </w:r>
     </w:p>
     <w:p>
-      <w:r>
-        <w:tab/>
-      </w:r>
-      <w:r>
-        <w:tab/>
-      </w:r>
-      <w:r>
-        <w:t>{</w:t>
+      <w:pPr>
+        <w:ind w:firstLine="720"/>
+      </w:pPr>
+      <w:r>
+        <w:t xml:space="preserve">static </w:t>
+      </w:r>
+      <w:r>
+        <w:t xml:space="preserve">bool </w:t>
+      </w:r>
+      <w:proofErr w:type="spellStart"/>
+      <w:proofErr w:type="gramStart"/>
+      <w:r>
+        <w:t>alarmManagerCompareData</w:t>
+      </w:r>
+      <w:proofErr w:type="spellEnd"/>
+      <w:r>
+        <w:t>(</w:t>
+      </w:r>
+      <w:proofErr w:type="gramEnd"/>
+      <w:r>
+        <w:t xml:space="preserve">uint32 </w:t>
+      </w:r>
+      <w:proofErr w:type="spellStart"/>
+      <w:r>
+        <w:rPr>
+          <w:rFonts w:cs="Calibri"/>
+        </w:rPr>
+        <w:t>ulTemperatureValue</w:t>
+      </w:r>
+      <w:proofErr w:type="spellEnd"/>
+      <w:r>
+        <w:rPr>
+          <w:rFonts w:cs="Calibri"/>
+        </w:rPr>
+        <w:t xml:space="preserve">, </w:t>
       </w:r>
     </w:p>
     <w:p>
       <w:pPr>
-        <w:spacing w:line="240" w:lineRule="auto"/>
-        <w:jc w:val="both"/>
+        <w:pStyle w:val="ListParagraph"/>
+        <w:ind w:left="1440"/>
+      </w:pPr>
+      <w:r>
         <w:rPr>
           <w:rFonts w:cs="Calibri"/>
         </w:rPr>
-      </w:pPr>
-      <w:r>
-        <w:tab/>
-      </w:r>
-      <w:r>
-        <w:tab/>
-      </w:r>
-      <w:r>
-        <w:tab/>
-      </w:r>
-      <w:r>
-        <w:t>//</w:t>
-      </w:r>
-      <w:r>
-        <w:t xml:space="preserve">compare the values </w:t>
-      </w:r>
+        <w:t xml:space="preserve">                                                              uint32 </w:t>
+      </w:r>
+      <w:proofErr w:type="spellStart"/>
       <w:r>
         <w:rPr>
           <w:rFonts w:cs="Calibri"/>
         </w:rPr>
-        <w:t>ulTemperatureValue</w:t>
-      </w:r>
-      <w:r>
-        <w:rPr>
-          <w:rFonts w:cs="Calibri"/>
-        </w:rPr>
-        <w:t xml:space="preserve"> and </w:t>
-      </w:r>
-      <w:r>
-        <w:rPr>
-          <w:rFonts w:cs="Calibri"/>
-        </w:rPr>
         <w:t>ulThresholdValue</w:t>
       </w:r>
+      <w:proofErr w:type="spellEnd"/>
+      <w:proofErr w:type="gramStart"/>
+      <w:r>
+        <w:t>)</w:t>
+      </w:r>
+      <w:r>
+        <w:t>;</w:t>
+      </w:r>
+      <w:proofErr w:type="gramEnd"/>
     </w:p>
     <w:p>
       <w:pPr>
-        <w:spacing w:line="240" w:lineRule="auto"/>
-        <w:ind w:left="2160"/>
-        <w:rPr>
-          <w:rFonts w:cs="Calibri"/>
-        </w:rPr>
-      </w:pPr>
-      <w:r>
-        <w:rPr>
-          <w:rFonts w:cs="Calibri"/>
-        </w:rPr>
-        <w:t xml:space="preserve">//activate the alarm if </w:t>
-      </w:r>
-      <w:r>
-        <w:rPr>
-          <w:rFonts w:cs="Calibri"/>
-        </w:rPr>
-        <w:t>ulTemperatureValue</w:t>
-      </w:r>
-      <w:r>
-        <w:rPr>
-          <w:rFonts w:cs="Calibri"/>
-        </w:rPr>
-        <w:t xml:space="preserve"> is greater than </w:t>
-      </w:r>
-      <w:r>
-        <w:rPr>
-          <w:rFonts w:cs="Calibri"/>
-        </w:rPr>
-        <w:t>//</w:t>
-      </w:r>
-      <w:r>
-        <w:rPr>
-          <w:rFonts w:cs="Calibri"/>
-        </w:rPr>
-        <w:t>ulThresholdValue</w:t>
-      </w:r>
+        <w:pStyle w:val="ListParagraph"/>
+        <w:ind w:left="1440"/>
+      </w:pPr>
     </w:p>
     <w:p>
       <w:pPr>
-        <w:spacing w:line="240" w:lineRule="auto"/>
-        <w:ind w:left="1440" w:firstLine="720"/>
-        <w:jc w:val="both"/>
+        <w:pStyle w:val="ListParagraph"/>
+        <w:numPr>
+          <w:ilvl w:val="0"/>
+          <w:numId w:val="26"/>
+        </w:numPr>
+      </w:pPr>
+      <w:r>
+        <w:t>C</w:t>
+      </w:r>
+      <w:r>
+        <w:t xml:space="preserve">ompare the values </w:t>
+      </w:r>
+      <w:proofErr w:type="spellStart"/>
+      <w:r>
         <w:rPr>
           <w:rFonts w:cs="Calibri"/>
         </w:rPr>
-      </w:pPr>
+        <w:t>ulTemperatureValue</w:t>
+      </w:r>
+      <w:proofErr w:type="spellEnd"/>
       <w:r>
         <w:rPr>
           <w:rFonts w:cs="Calibri"/>
         </w:rPr>
-        <w:t>If(</w:t>
-      </w:r>
+        <w:t xml:space="preserve"> and </w:t>
+      </w:r>
+      <w:proofErr w:type="spellStart"/>
       <w:r>
         <w:rPr>
           <w:rFonts w:cs="Calibri"/>
         </w:rPr>
-        <w:t>ulTemperatureValue</w:t>
-      </w:r>
-      <w:r>
-        <w:rPr>
-          <w:rFonts w:cs="Calibri"/>
-        </w:rPr>
-        <w:t xml:space="preserve"> &gt; </w:t>
-      </w:r>
-      <w:r>
-        <w:rPr>
-          <w:rFonts w:cs="Calibri"/>
-        </w:rPr>
         <w:t>ulThresholdValue</w:t>
       </w:r>
-      <w:r>
-        <w:rPr>
-          <w:rFonts w:cs="Calibri"/>
-        </w:rPr>
-        <w:t>)</w:t>
-      </w:r>
-    </w:p>
-    <w:p>
-      <w:pPr>
-        <w:spacing w:line="240" w:lineRule="auto"/>
-        <w:ind w:left="1440" w:firstLine="720"/>
-        <w:jc w:val="both"/>
-        <w:rPr>
-          <w:rFonts w:cs="Calibri"/>
-        </w:rPr>
-      </w:pPr>
-      <w:r>
-        <w:rPr>
-          <w:rFonts w:cs="Calibri"/>
-        </w:rPr>
-        <w:t>{</w:t>
-      </w:r>
-    </w:p>
-    <w:p>
-      <w:pPr>
-        <w:spacing w:line="240" w:lineRule="auto"/>
-        <w:ind w:left="720" w:firstLine="720"/>
-        <w:jc w:val="both"/>
-        <w:rPr>
-          <w:rFonts w:cs="Calibri"/>
-        </w:rPr>
-      </w:pPr>
-      <w:r>
-        <w:rPr>
-          <w:rFonts w:cs="Calibri"/>
-        </w:rPr>
-        <w:t xml:space="preserve"> </w:t>
-      </w:r>
-      <w:r>
-        <w:rPr>
-          <w:rFonts w:cs="Calibri"/>
-        </w:rPr>
-        <w:tab/>
-      </w:r>
-      <w:r>
-        <w:rPr>
-          <w:rFonts w:cs="Calibri"/>
-        </w:rPr>
-        <w:tab/>
-      </w:r>
-      <w:r>
-        <w:rPr>
-          <w:rFonts w:cs="Calibri"/>
-        </w:rPr>
-        <w:t>//activate the alarm</w:t>
-      </w:r>
+      <w:proofErr w:type="spellEnd"/>
     </w:p>
     <w:p>
       <w:pPr>
@@ -1983,16 +2387,57 @@
       </w:pPr>
       <w:r>
         <w:rPr>
-          <w:rFonts w:cs="Calibri"/>
-        </w:rPr>
-        <w:tab/>
-      </w:r>
-      <w:r>
-        <w:rPr>
-          <w:rFonts w:cs="Calibri"/>
-        </w:rPr>
-        <w:tab/>
-      </w:r>
+          <w:rFonts w:ascii="Calibri" w:hAnsi="Calibri" w:cs="Calibri"/>
+          <w:sz w:val="22"/>
+          <w:szCs w:val="22"/>
+        </w:rPr>
+        <w:t>A</w:t>
+      </w:r>
+      <w:r>
+        <w:rPr>
+          <w:rFonts w:ascii="Calibri" w:hAnsi="Calibri" w:cs="Calibri"/>
+          <w:sz w:val="22"/>
+          <w:szCs w:val="22"/>
+        </w:rPr>
+        <w:t xml:space="preserve">ctivate the alarm if </w:t>
+      </w:r>
+      <w:proofErr w:type="spellStart"/>
+      <w:r>
+        <w:rPr>
+          <w:rFonts w:ascii="Calibri" w:hAnsi="Calibri" w:cs="Calibri"/>
+          <w:sz w:val="22"/>
+          <w:szCs w:val="22"/>
+        </w:rPr>
+        <w:t>ulTemperatureValue</w:t>
+      </w:r>
+      <w:proofErr w:type="spellEnd"/>
+      <w:r>
+        <w:rPr>
+          <w:rFonts w:ascii="Calibri" w:hAnsi="Calibri" w:cs="Calibri"/>
+          <w:sz w:val="22"/>
+          <w:szCs w:val="22"/>
+        </w:rPr>
+        <w:t xml:space="preserve"> is greater than </w:t>
+      </w:r>
+      <w:proofErr w:type="spellStart"/>
+      <w:r>
+        <w:rPr>
+          <w:rFonts w:ascii="Calibri" w:hAnsi="Calibri" w:cs="Calibri"/>
+          <w:sz w:val="22"/>
+          <w:szCs w:val="22"/>
+        </w:rPr>
+        <w:t>ulThresholdValue</w:t>
+      </w:r>
+      <w:proofErr w:type="spellEnd"/>
+      <w:r>
+        <w:rPr>
+          <w:rFonts w:ascii="Calibri" w:hAnsi="Calibri" w:cs="Calibri"/>
+          <w:sz w:val="22"/>
+          <w:szCs w:val="22"/>
+        </w:rPr>
+        <w:t xml:space="preserve"> by calling the function </w:t>
+      </w:r>
+      <w:proofErr w:type="spellStart"/>
       <w:r>
         <w:rPr>
           <w:rFonts w:ascii="Calibri" w:hAnsi="Calibri" w:cs="Calibri"/>
@@ -2002,6 +2447,7 @@
         </w:rPr>
         <w:t>alarmManagerAlarmOn</w:t>
       </w:r>
+      <w:proofErr w:type="spellEnd"/>
       <w:r>
         <w:rPr>
           <w:rFonts w:ascii="Calibri" w:hAnsi="Calibri" w:cs="Calibri"/>
@@ -2009,8 +2455,9 @@
           <w:szCs w:val="22"/>
           <w:lang w:val="en-US" w:eastAsia="en-US"/>
         </w:rPr>
-        <w:t>(ucAlarmOnTime)</w:t>
-      </w:r>
+        <w:t>(</w:t>
+      </w:r>
+      <w:proofErr w:type="spellStart"/>
       <w:r>
         <w:rPr>
           <w:rFonts w:ascii="Calibri" w:hAnsi="Calibri" w:cs="Calibri"/>
@@ -2018,50 +2465,130 @@
           <w:szCs w:val="22"/>
           <w:lang w:val="en-US" w:eastAsia="en-US"/>
         </w:rPr>
+        <w:t>ucAlarmOnTime</w:t>
+      </w:r>
+      <w:proofErr w:type="spellEnd"/>
+      <w:proofErr w:type="gramStart"/>
+      <w:r>
+        <w:rPr>
+          <w:rFonts w:ascii="Calibri" w:hAnsi="Calibri" w:cs="Calibri"/>
+          <w:sz w:val="22"/>
+          <w:szCs w:val="22"/>
+          <w:lang w:val="en-US" w:eastAsia="en-US"/>
+        </w:rPr>
+        <w:t>);</w:t>
+      </w:r>
+      <w:proofErr w:type="gramEnd"/>
+    </w:p>
+    <w:p/>
+    <w:p>
+      <w:pPr>
+        <w:pStyle w:val="NormalWeb"/>
+        <w:spacing w:before="0" w:beforeAutospacing="0" w:after="0" w:afterAutospacing="0"/>
+        <w:ind w:firstLine="720"/>
+        <w:jc w:val="both"/>
+        <w:rPr>
+          <w:rFonts w:ascii="Calibri" w:hAnsi="Calibri" w:cs="Calibri"/>
+          <w:sz w:val="22"/>
+          <w:szCs w:val="22"/>
+          <w:lang w:val="en-US" w:eastAsia="en-US"/>
+        </w:rPr>
+      </w:pPr>
+      <w:r>
+        <w:rPr>
+          <w:rFonts w:ascii="Calibri" w:hAnsi="Calibri" w:cs="Calibri"/>
+          <w:sz w:val="22"/>
+          <w:szCs w:val="22"/>
+          <w:lang w:val="en-US" w:eastAsia="en-US"/>
+        </w:rPr>
+        <w:t xml:space="preserve">static </w:t>
+      </w:r>
+      <w:r>
+        <w:rPr>
+          <w:rFonts w:ascii="Calibri" w:hAnsi="Calibri" w:cs="Calibri"/>
+          <w:sz w:val="22"/>
+          <w:szCs w:val="22"/>
+          <w:lang w:val="en-US" w:eastAsia="en-US"/>
+        </w:rPr>
+        <w:t xml:space="preserve">bool </w:t>
+      </w:r>
+      <w:proofErr w:type="spellStart"/>
+      <w:proofErr w:type="gramStart"/>
+      <w:r>
+        <w:rPr>
+          <w:rFonts w:ascii="Calibri" w:hAnsi="Calibri" w:cs="Calibri"/>
+          <w:sz w:val="22"/>
+          <w:szCs w:val="22"/>
+          <w:lang w:val="en-US" w:eastAsia="en-US"/>
+        </w:rPr>
+        <w:t>alarmManagerAlarmOn</w:t>
+      </w:r>
+      <w:proofErr w:type="spellEnd"/>
+      <w:r>
+        <w:rPr>
+          <w:rFonts w:ascii="Calibri" w:hAnsi="Calibri" w:cs="Calibri"/>
+          <w:sz w:val="22"/>
+          <w:szCs w:val="22"/>
+          <w:lang w:val="en-US" w:eastAsia="en-US"/>
+        </w:rPr>
+        <w:t>(</w:t>
+      </w:r>
+      <w:proofErr w:type="gramEnd"/>
+      <w:r>
+        <w:rPr>
+          <w:rFonts w:ascii="Calibri" w:hAnsi="Calibri" w:cs="Calibri"/>
+          <w:sz w:val="22"/>
+          <w:szCs w:val="22"/>
+          <w:lang w:val="en-US" w:eastAsia="en-US"/>
+        </w:rPr>
+        <w:t xml:space="preserve">uint8 </w:t>
+      </w:r>
+      <w:proofErr w:type="spellStart"/>
+      <w:r>
+        <w:rPr>
+          <w:rFonts w:ascii="Calibri" w:hAnsi="Calibri" w:cs="Calibri"/>
+          <w:sz w:val="22"/>
+          <w:szCs w:val="22"/>
+          <w:lang w:val="en-US" w:eastAsia="en-US"/>
+        </w:rPr>
+        <w:t>ucAlarmOnTime</w:t>
+      </w:r>
+      <w:proofErr w:type="spellEnd"/>
+      <w:proofErr w:type="gramStart"/>
+      <w:r>
+        <w:rPr>
+          <w:rFonts w:ascii="Calibri" w:hAnsi="Calibri" w:cs="Calibri"/>
+          <w:sz w:val="22"/>
+          <w:szCs w:val="22"/>
+          <w:lang w:val="en-US" w:eastAsia="en-US"/>
+        </w:rPr>
+        <w:t>)</w:t>
+      </w:r>
+      <w:r>
+        <w:rPr>
+          <w:rFonts w:ascii="Calibri" w:hAnsi="Calibri" w:cs="Calibri"/>
+          <w:sz w:val="22"/>
+          <w:szCs w:val="22"/>
+          <w:lang w:val="en-US" w:eastAsia="en-US"/>
+        </w:rPr>
         <w:t>;</w:t>
       </w:r>
+      <w:proofErr w:type="gramEnd"/>
     </w:p>
     <w:p>
       <w:pPr>
-        <w:spacing w:line="240" w:lineRule="auto"/>
-        <w:ind w:left="720" w:firstLine="720"/>
+        <w:pStyle w:val="NormalWeb"/>
+        <w:spacing w:before="0" w:beforeAutospacing="0" w:after="0" w:afterAutospacing="0"/>
+        <w:ind w:firstLine="720"/>
         <w:jc w:val="both"/>
         <w:rPr>
-          <w:rFonts w:cs="Calibri"/>
+          <w:rFonts w:ascii="Calibri" w:hAnsi="Calibri" w:cs="Calibri"/>
+          <w:sz w:val="22"/>
+          <w:szCs w:val="22"/>
+          <w:lang w:val="en-US" w:eastAsia="en-US"/>
         </w:rPr>
       </w:pPr>
     </w:p>
-    <w:p>
-      <w:pPr>
-        <w:spacing w:line="240" w:lineRule="auto"/>
-        <w:ind w:left="1440" w:firstLine="720"/>
-        <w:jc w:val="both"/>
-      </w:pPr>
-      <w:r>
-        <w:rPr>
-          <w:rFonts w:cs="Calibri"/>
-        </w:rPr>
-        <w:t>}</w:t>
-      </w:r>
-      <w:r>
-        <w:rPr>
-          <w:rFonts w:cs="Calibri"/>
-        </w:rPr>
-        <w:tab/>
-      </w:r>
-    </w:p>
-    <w:p>
-      <w:r>
-        <w:tab/>
-      </w:r>
-      <w:r>
-        <w:tab/>
-      </w:r>
-      <w:r>
-        <w:t>}</w:t>
-      </w:r>
-    </w:p>
-    <w:p/>
     <w:p>
       <w:pPr>
         <w:pStyle w:val="NormalWeb"/>
@@ -2085,272 +2612,8 @@
           <w:szCs w:val="22"/>
           <w:lang w:val="en-US" w:eastAsia="en-US"/>
         </w:rPr>
-        <w:t xml:space="preserve">bool </w:t>
-      </w:r>
-      <w:r>
-        <w:rPr>
-          <w:rFonts w:ascii="Calibri" w:hAnsi="Calibri" w:cs="Calibri"/>
-          <w:sz w:val="22"/>
-          <w:szCs w:val="22"/>
-          <w:lang w:val="en-US" w:eastAsia="en-US"/>
-        </w:rPr>
-        <w:t>alarmManagerAlarmOn</w:t>
-      </w:r>
-      <w:r>
-        <w:rPr>
-          <w:rFonts w:ascii="Calibri" w:hAnsi="Calibri" w:cs="Calibri"/>
-          <w:sz w:val="22"/>
-          <w:szCs w:val="22"/>
-          <w:lang w:val="en-US" w:eastAsia="en-US"/>
-        </w:rPr>
-        <w:t>(uint8 ucAlarmOnTime)</w:t>
-      </w:r>
-    </w:p>
-    <w:p>
-      <w:pPr>
-        <w:pStyle w:val="NormalWeb"/>
-        <w:spacing w:before="0" w:beforeAutospacing="0" w:after="0" w:afterAutospacing="0"/>
-        <w:ind w:left="1440"/>
-        <w:jc w:val="both"/>
-        <w:rPr>
-          <w:rFonts w:ascii="Calibri" w:hAnsi="Calibri" w:cs="Calibri"/>
-          <w:sz w:val="22"/>
-          <w:szCs w:val="22"/>
-          <w:lang w:val="en-US" w:eastAsia="en-US"/>
-        </w:rPr>
-      </w:pPr>
-      <w:r>
-        <w:rPr>
-          <w:rFonts w:ascii="Calibri" w:hAnsi="Calibri" w:cs="Calibri"/>
-          <w:sz w:val="22"/>
-          <w:szCs w:val="22"/>
-          <w:lang w:val="en-US" w:eastAsia="en-US"/>
-        </w:rPr>
-        <w:t>{</w:t>
-      </w:r>
-    </w:p>
-    <w:p>
-      <w:pPr>
-        <w:pStyle w:val="NormalWeb"/>
-        <w:spacing w:before="0" w:beforeAutospacing="0" w:after="0" w:afterAutospacing="0"/>
-        <w:ind w:left="1440"/>
-        <w:jc w:val="both"/>
-        <w:rPr>
-          <w:rFonts w:ascii="Calibri" w:hAnsi="Calibri" w:cs="Calibri"/>
-          <w:sz w:val="22"/>
-          <w:szCs w:val="22"/>
-          <w:lang w:val="en-US" w:eastAsia="en-US"/>
-        </w:rPr>
-      </w:pPr>
-      <w:r>
-        <w:rPr>
-          <w:rFonts w:ascii="Calibri" w:hAnsi="Calibri" w:cs="Calibri"/>
-          <w:sz w:val="22"/>
-          <w:szCs w:val="22"/>
-          <w:lang w:val="en-US" w:eastAsia="en-US"/>
-        </w:rPr>
-        <w:tab/>
-        <w:t>//Turn on the alarm</w:t>
-      </w:r>
-    </w:p>
-    <w:p>
-      <w:pPr>
-        <w:pStyle w:val="NormalWeb"/>
-        <w:spacing w:before="0" w:beforeAutospacing="0" w:after="0" w:afterAutospacing="0"/>
-        <w:ind w:left="1440"/>
-        <w:jc w:val="both"/>
-        <w:rPr>
-          <w:rFonts w:ascii="Calibri" w:hAnsi="Calibri" w:cs="Calibri"/>
-          <w:sz w:val="22"/>
-          <w:szCs w:val="22"/>
-          <w:lang w:val="en-US" w:eastAsia="en-US"/>
-        </w:rPr>
-      </w:pPr>
-      <w:r>
-        <w:rPr>
-          <w:rFonts w:ascii="Calibri" w:hAnsi="Calibri" w:cs="Calibri"/>
-          <w:sz w:val="22"/>
-          <w:szCs w:val="22"/>
-          <w:lang w:val="en-US" w:eastAsia="en-US"/>
-        </w:rPr>
-        <w:lastRenderedPageBreak/>
-        <w:tab/>
-        <w:t xml:space="preserve">//wait for </w:t>
-      </w:r>
-      <w:r>
-        <w:rPr>
-          <w:rFonts w:ascii="Calibri" w:hAnsi="Calibri" w:cs="Calibri"/>
-          <w:sz w:val="22"/>
-          <w:szCs w:val="22"/>
-          <w:lang w:val="en-US" w:eastAsia="en-US"/>
-        </w:rPr>
-        <w:t>ucAlarmOnTime</w:t>
-      </w:r>
-      <w:r>
-        <w:rPr>
-          <w:rFonts w:ascii="Calibri" w:hAnsi="Calibri" w:cs="Calibri"/>
-          <w:sz w:val="22"/>
-          <w:szCs w:val="22"/>
-          <w:lang w:val="en-US" w:eastAsia="en-US"/>
-        </w:rPr>
-        <w:t xml:space="preserve"> second</w:t>
-      </w:r>
-    </w:p>
-    <w:p>
-      <w:pPr>
-        <w:pStyle w:val="NormalWeb"/>
-        <w:spacing w:before="0" w:beforeAutospacing="0" w:after="0" w:afterAutospacing="0"/>
-        <w:ind w:left="1440"/>
-        <w:jc w:val="both"/>
-        <w:rPr>
-          <w:rFonts w:ascii="Calibri" w:hAnsi="Calibri" w:cs="Calibri"/>
-          <w:sz w:val="22"/>
-          <w:szCs w:val="22"/>
-          <w:lang w:val="en-US" w:eastAsia="en-US"/>
-        </w:rPr>
-      </w:pPr>
-      <w:r>
-        <w:rPr>
-          <w:rFonts w:ascii="Calibri" w:hAnsi="Calibri" w:cs="Calibri"/>
-          <w:sz w:val="22"/>
-          <w:szCs w:val="22"/>
-          <w:lang w:val="en-US" w:eastAsia="en-US"/>
-        </w:rPr>
-        <w:tab/>
-      </w:r>
-    </w:p>
-    <w:p>
-      <w:pPr>
-        <w:pStyle w:val="NormalWeb"/>
-        <w:spacing w:before="0" w:beforeAutospacing="0" w:after="0" w:afterAutospacing="0"/>
-        <w:ind w:left="1440" w:firstLine="720"/>
-        <w:jc w:val="both"/>
-        <w:rPr>
-          <w:rFonts w:ascii="Calibri" w:hAnsi="Calibri" w:cs="Calibri"/>
-          <w:sz w:val="22"/>
-          <w:szCs w:val="22"/>
-          <w:lang w:val="en-US" w:eastAsia="en-US"/>
-        </w:rPr>
-      </w:pPr>
-      <w:r>
-        <w:rPr>
-          <w:rFonts w:ascii="Calibri" w:hAnsi="Calibri" w:cs="Calibri"/>
-          <w:sz w:val="22"/>
-          <w:szCs w:val="22"/>
-          <w:lang w:val="en-US" w:eastAsia="en-US"/>
-        </w:rPr>
-        <w:t>//Turn off the alarm</w:t>
-      </w:r>
-      <w:r>
-        <w:rPr>
-          <w:rFonts w:ascii="Calibri" w:hAnsi="Calibri" w:cs="Calibri"/>
-          <w:sz w:val="22"/>
-          <w:szCs w:val="22"/>
-          <w:lang w:val="en-US" w:eastAsia="en-US"/>
-        </w:rPr>
-        <w:tab/>
-      </w:r>
-    </w:p>
-    <w:p>
-      <w:pPr>
-        <w:pStyle w:val="NormalWeb"/>
-        <w:spacing w:before="0" w:beforeAutospacing="0" w:after="0" w:afterAutospacing="0"/>
-        <w:ind w:left="1440" w:firstLine="720"/>
-        <w:jc w:val="both"/>
-        <w:rPr>
-          <w:rFonts w:ascii="Calibri" w:hAnsi="Calibri" w:cs="Calibri"/>
-          <w:sz w:val="22"/>
-          <w:szCs w:val="22"/>
-          <w:lang w:val="en-US" w:eastAsia="en-US"/>
-        </w:rPr>
-      </w:pPr>
-      <w:r>
-        <w:rPr>
-          <w:rFonts w:ascii="Calibri" w:hAnsi="Calibri" w:cs="Calibri"/>
-          <w:sz w:val="22"/>
-          <w:szCs w:val="22"/>
-          <w:lang w:val="en-US" w:eastAsia="en-US"/>
-        </w:rPr>
-        <w:t>alarmManagerAlarmO</w:t>
-      </w:r>
-      <w:r>
-        <w:rPr>
-          <w:rFonts w:ascii="Calibri" w:hAnsi="Calibri" w:cs="Calibri"/>
-          <w:sz w:val="22"/>
-          <w:szCs w:val="22"/>
-          <w:lang w:val="en-US" w:eastAsia="en-US"/>
-        </w:rPr>
-        <w:t>ff</w:t>
-      </w:r>
-      <w:r>
-        <w:rPr>
-          <w:rFonts w:ascii="Calibri" w:hAnsi="Calibri" w:cs="Calibri"/>
-          <w:sz w:val="22"/>
-          <w:szCs w:val="22"/>
-          <w:lang w:val="en-US" w:eastAsia="en-US"/>
-        </w:rPr>
-        <w:t>()</w:t>
-      </w:r>
-      <w:r>
-        <w:rPr>
-          <w:rFonts w:ascii="Calibri" w:hAnsi="Calibri" w:cs="Calibri"/>
-          <w:sz w:val="22"/>
-          <w:szCs w:val="22"/>
-          <w:lang w:val="en-US" w:eastAsia="en-US"/>
-        </w:rPr>
-        <w:t>;</w:t>
-      </w:r>
-    </w:p>
-    <w:p>
-      <w:pPr>
-        <w:pStyle w:val="NormalWeb"/>
-        <w:spacing w:before="0" w:beforeAutospacing="0" w:after="0" w:afterAutospacing="0"/>
-        <w:ind w:left="1440"/>
-        <w:jc w:val="both"/>
-        <w:rPr>
-          <w:rFonts w:ascii="Calibri" w:hAnsi="Calibri" w:cs="Calibri"/>
-          <w:sz w:val="22"/>
-          <w:szCs w:val="22"/>
-          <w:lang w:val="en-US" w:eastAsia="en-US"/>
-        </w:rPr>
-      </w:pPr>
-      <w:r>
-        <w:rPr>
-          <w:rFonts w:ascii="Calibri" w:hAnsi="Calibri" w:cs="Calibri"/>
-          <w:sz w:val="22"/>
-          <w:szCs w:val="22"/>
-          <w:lang w:val="en-US" w:eastAsia="en-US"/>
-        </w:rPr>
-        <w:t>}</w:t>
-      </w:r>
-    </w:p>
-    <w:p>
-      <w:pPr>
-        <w:pStyle w:val="NormalWeb"/>
-        <w:spacing w:before="0" w:beforeAutospacing="0" w:after="0" w:afterAutospacing="0"/>
-        <w:ind w:left="1440"/>
-        <w:jc w:val="both"/>
-        <w:rPr>
-          <w:rFonts w:ascii="Calibri" w:hAnsi="Calibri" w:cs="Calibri"/>
-          <w:sz w:val="22"/>
-          <w:szCs w:val="22"/>
-          <w:lang w:val="en-US" w:eastAsia="en-US"/>
-        </w:rPr>
-      </w:pPr>
-    </w:p>
-    <w:p>
-      <w:pPr>
-        <w:pStyle w:val="NormalWeb"/>
-        <w:spacing w:before="0" w:beforeAutospacing="0" w:after="0" w:afterAutospacing="0"/>
-        <w:ind w:left="1440"/>
-        <w:jc w:val="both"/>
-        <w:rPr>
-          <w:rFonts w:ascii="Calibri" w:hAnsi="Calibri" w:cs="Calibri"/>
-          <w:sz w:val="22"/>
-          <w:szCs w:val="22"/>
-          <w:lang w:val="en-US" w:eastAsia="en-US"/>
-        </w:rPr>
-      </w:pPr>
+        <w:t>Turn on the alarm</w:t>
+      </w:r>
     </w:p>
     <w:p>
       <w:pPr>
@@ -2375,7 +2638,7 @@
           <w:szCs w:val="22"/>
           <w:lang w:val="en-US" w:eastAsia="en-US"/>
         </w:rPr>
-        <w:t xml:space="preserve">bool </w:t>
+        <w:t>W</w:t>
       </w:r>
       <w:r>
         <w:rPr>
@@ -2384,8 +2647,9 @@
           <w:szCs w:val="22"/>
           <w:lang w:val="en-US" w:eastAsia="en-US"/>
         </w:rPr>
-        <w:t>alarmManagerAlarmO</w:t>
-      </w:r>
+        <w:t xml:space="preserve">ait for </w:t>
+      </w:r>
+      <w:proofErr w:type="spellStart"/>
       <w:r>
         <w:rPr>
           <w:rFonts w:ascii="Calibri" w:hAnsi="Calibri" w:cs="Calibri"/>
@@ -2393,7 +2657,101 @@
           <w:szCs w:val="22"/>
           <w:lang w:val="en-US" w:eastAsia="en-US"/>
         </w:rPr>
-        <w:t>ff(void)</w:t>
+        <w:t>ucAlarmOnTime</w:t>
+      </w:r>
+      <w:proofErr w:type="spellEnd"/>
+      <w:r>
+        <w:rPr>
+          <w:rFonts w:ascii="Calibri" w:hAnsi="Calibri" w:cs="Calibri"/>
+          <w:sz w:val="22"/>
+          <w:szCs w:val="22"/>
+          <w:lang w:val="en-US" w:eastAsia="en-US"/>
+        </w:rPr>
+        <w:t xml:space="preserve"> second</w:t>
+      </w:r>
+      <w:r>
+        <w:rPr>
+          <w:rFonts w:ascii="Calibri" w:hAnsi="Calibri" w:cs="Calibri"/>
+          <w:sz w:val="22"/>
+          <w:szCs w:val="22"/>
+          <w:lang w:val="en-US" w:eastAsia="en-US"/>
+        </w:rPr>
+        <w:tab/>
+      </w:r>
+    </w:p>
+    <w:p>
+      <w:pPr>
+        <w:pStyle w:val="NormalWeb"/>
+        <w:numPr>
+          <w:ilvl w:val="0"/>
+          <w:numId w:val="18"/>
+        </w:numPr>
+        <w:spacing w:before="0" w:beforeAutospacing="0" w:after="0" w:afterAutospacing="0"/>
+        <w:jc w:val="both"/>
+        <w:rPr>
+          <w:rFonts w:ascii="Calibri" w:hAnsi="Calibri" w:cs="Calibri"/>
+          <w:sz w:val="22"/>
+          <w:szCs w:val="22"/>
+          <w:lang w:val="en-US" w:eastAsia="en-US"/>
+        </w:rPr>
+      </w:pPr>
+      <w:r>
+        <w:rPr>
+          <w:rFonts w:ascii="Calibri" w:hAnsi="Calibri" w:cs="Calibri"/>
+          <w:sz w:val="22"/>
+          <w:szCs w:val="22"/>
+          <w:lang w:val="en-US" w:eastAsia="en-US"/>
+        </w:rPr>
+        <w:t>Turn off the alarm</w:t>
+      </w:r>
+      <w:r>
+        <w:rPr>
+          <w:rFonts w:ascii="Calibri" w:hAnsi="Calibri" w:cs="Calibri"/>
+          <w:sz w:val="22"/>
+          <w:szCs w:val="22"/>
+          <w:lang w:val="en-US" w:eastAsia="en-US"/>
+        </w:rPr>
+        <w:t xml:space="preserve"> by calling the function </w:t>
+      </w:r>
+      <w:proofErr w:type="spellStart"/>
+      <w:proofErr w:type="gramStart"/>
+      <w:r>
+        <w:rPr>
+          <w:rFonts w:ascii="Calibri" w:hAnsi="Calibri" w:cs="Calibri"/>
+          <w:sz w:val="22"/>
+          <w:szCs w:val="22"/>
+          <w:lang w:val="en-US" w:eastAsia="en-US"/>
+        </w:rPr>
+        <w:t>alarmManagerAlarmO</w:t>
+      </w:r>
+      <w:r>
+        <w:rPr>
+          <w:rFonts w:ascii="Calibri" w:hAnsi="Calibri" w:cs="Calibri"/>
+          <w:sz w:val="22"/>
+          <w:szCs w:val="22"/>
+          <w:lang w:val="en-US" w:eastAsia="en-US"/>
+        </w:rPr>
+        <w:t>ff</w:t>
+      </w:r>
+      <w:proofErr w:type="spellEnd"/>
+      <w:r>
+        <w:rPr>
+          <w:rFonts w:ascii="Calibri" w:hAnsi="Calibri" w:cs="Calibri"/>
+          <w:sz w:val="22"/>
+          <w:szCs w:val="22"/>
+          <w:lang w:val="en-US" w:eastAsia="en-US"/>
+        </w:rPr>
+        <w:t>(</w:t>
+      </w:r>
+      <w:proofErr w:type="gramEnd"/>
+      <w:r>
+        <w:rPr>
+          <w:rFonts w:ascii="Calibri" w:hAnsi="Calibri" w:cs="Calibri"/>
+          <w:sz w:val="22"/>
+          <w:szCs w:val="22"/>
+          <w:lang w:val="en-US" w:eastAsia="en-US"/>
+        </w:rPr>
+        <w:t>)</w:t>
       </w:r>
     </w:p>
     <w:p>
@@ -2409,21 +2767,26 @@
           <w:lang w:val="en-US" w:eastAsia="en-US"/>
         </w:rPr>
       </w:pPr>
-      <w:r>
+    </w:p>
+    <w:p>
+      <w:pPr>
+        <w:pStyle w:val="NormalWeb"/>
+        <w:spacing w:before="0" w:beforeAutospacing="0" w:after="0" w:afterAutospacing="0"/>
+        <w:ind w:left="1440"/>
+        <w:jc w:val="both"/>
         <w:rPr>
           <w:rFonts w:ascii="Calibri" w:hAnsi="Calibri" w:cs="Calibri"/>
           <w:sz w:val="22"/>
           <w:szCs w:val="22"/>
           <w:lang w:val="en-US" w:eastAsia="en-US"/>
         </w:rPr>
-        <w:t>{</w:t>
-      </w:r>
+      </w:pPr>
     </w:p>
     <w:p>
       <w:pPr>
         <w:pStyle w:val="NormalWeb"/>
         <w:spacing w:before="0" w:beforeAutospacing="0" w:after="0" w:afterAutospacing="0"/>
-        <w:ind w:left="1440"/>
+        <w:ind w:firstLine="720"/>
         <w:jc w:val="both"/>
         <w:rPr>
           <w:rFonts w:ascii="Calibri" w:hAnsi="Calibri" w:cs="Calibri"/>
@@ -2439,23 +2802,18 @@
           <w:szCs w:val="22"/>
           <w:lang w:val="en-US" w:eastAsia="en-US"/>
         </w:rPr>
-        <w:tab/>
-        <w:t xml:space="preserve">//Turn off the alarm </w:t>
-      </w:r>
-    </w:p>
-    <w:p>
-      <w:pPr>
-        <w:pStyle w:val="NormalWeb"/>
-        <w:spacing w:before="0" w:beforeAutospacing="0" w:after="0" w:afterAutospacing="0"/>
-        <w:ind w:left="1440"/>
-        <w:jc w:val="both"/>
+        <w:t xml:space="preserve">static </w:t>
+      </w:r>
+      <w:r>
         <w:rPr>
           <w:rFonts w:ascii="Calibri" w:hAnsi="Calibri" w:cs="Calibri"/>
           <w:sz w:val="22"/>
           <w:szCs w:val="22"/>
           <w:lang w:val="en-US" w:eastAsia="en-US"/>
         </w:rPr>
-      </w:pPr>
+        <w:t xml:space="preserve">bool </w:t>
+      </w:r>
+      <w:proofErr w:type="spellStart"/>
       <w:r>
         <w:rPr>
           <w:rFonts w:ascii="Calibri" w:hAnsi="Calibri" w:cs="Calibri"/>
@@ -2463,17 +2821,103 @@
           <w:szCs w:val="22"/>
           <w:lang w:val="en-US" w:eastAsia="en-US"/>
         </w:rPr>
-        <w:t>}</w:t>
+        <w:t>alarmManagerAlarmO</w:t>
+      </w:r>
+      <w:r>
+        <w:rPr>
+          <w:rFonts w:ascii="Calibri" w:hAnsi="Calibri" w:cs="Calibri"/>
+          <w:sz w:val="22"/>
+          <w:szCs w:val="22"/>
+          <w:lang w:val="en-US" w:eastAsia="en-US"/>
+        </w:rPr>
+        <w:t>ff</w:t>
+      </w:r>
+      <w:proofErr w:type="spellEnd"/>
+      <w:r>
+        <w:rPr>
+          <w:rFonts w:ascii="Calibri" w:hAnsi="Calibri" w:cs="Calibri"/>
+          <w:sz w:val="22"/>
+          <w:szCs w:val="22"/>
+          <w:lang w:val="en-US" w:eastAsia="en-US"/>
+        </w:rPr>
+        <w:t>(void)</w:t>
       </w:r>
     </w:p>
-    <w:p/>
     <w:p>
       <w:pPr>
+        <w:pStyle w:val="NormalWeb"/>
+        <w:spacing w:before="0" w:beforeAutospacing="0" w:after="0" w:afterAutospacing="0"/>
+        <w:ind w:firstLine="720"/>
+        <w:jc w:val="both"/>
+        <w:rPr>
+          <w:rFonts w:ascii="Calibri" w:hAnsi="Calibri" w:cs="Calibri"/>
+          <w:sz w:val="22"/>
+          <w:szCs w:val="22"/>
+          <w:lang w:val="en-US" w:eastAsia="en-US"/>
+        </w:rPr>
+      </w:pPr>
+    </w:p>
+    <w:p>
+      <w:pPr>
+        <w:pStyle w:val="NormalWeb"/>
+        <w:numPr>
+          <w:ilvl w:val="0"/>
+          <w:numId w:val="27"/>
+        </w:numPr>
+        <w:spacing w:before="0" w:beforeAutospacing="0" w:after="0" w:afterAutospacing="0"/>
+        <w:jc w:val="both"/>
+        <w:rPr>
+          <w:rFonts w:ascii="Calibri" w:hAnsi="Calibri" w:cs="Calibri"/>
+          <w:sz w:val="22"/>
+          <w:szCs w:val="22"/>
+          <w:lang w:val="en-US" w:eastAsia="en-US"/>
+        </w:rPr>
+      </w:pPr>
+      <w:r>
+        <w:rPr>
+          <w:rFonts w:ascii="Calibri" w:hAnsi="Calibri" w:cs="Calibri"/>
+          <w:sz w:val="22"/>
+          <w:szCs w:val="22"/>
+          <w:lang w:val="en-US" w:eastAsia="en-US"/>
+        </w:rPr>
+        <w:t>Turn off the alarm</w:t>
+      </w:r>
+    </w:p>
+    <w:p>
+      <w:pPr>
         <w:pStyle w:val="Heading2"/>
       </w:pPr>
       <w:r>
         <w:t>4. Data Structures</w:t>
       </w:r>
+    </w:p>
+    <w:p>
+      <w:pPr>
+        <w:pStyle w:val="ListParagraph"/>
+        <w:numPr>
+          <w:ilvl w:val="0"/>
+          <w:numId w:val="11"/>
+        </w:numPr>
+      </w:pPr>
+      <w:r>
+        <w:t xml:space="preserve">Global variable </w:t>
+      </w:r>
+    </w:p>
+    <w:p>
+      <w:pPr>
+        <w:pStyle w:val="ListParagraph"/>
+      </w:pPr>
+      <w:r>
+        <w:t xml:space="preserve">Shared memory used to update temperature value, </w:t>
+      </w:r>
+      <w:r>
+        <w:t xml:space="preserve">uint32 </w:t>
+      </w:r>
+      <w:proofErr w:type="spellStart"/>
+      <w:r>
+        <w:t>ulCurrentTemperature</w:t>
+      </w:r>
+      <w:proofErr w:type="spellEnd"/>
     </w:p>
     <w:p>
       <w:pPr>
@@ -2484,11 +2928,99 @@
         </w:numPr>
       </w:pPr>
       <w:r>
-        <w:t>Variable to store the measured temperature</w:t>
-      </w:r>
-      <w:r>
-        <w:t>, uint32 ulTemperatureValue</w:t>
-      </w:r>
+        <w:t>Sensor module</w:t>
+      </w:r>
+    </w:p>
+    <w:p>
+      <w:pPr>
+        <w:pStyle w:val="ListParagraph"/>
+        <w:numPr>
+          <w:ilvl w:val="0"/>
+          <w:numId w:val="27"/>
+        </w:numPr>
+      </w:pPr>
+      <w:r>
+        <w:t xml:space="preserve">Structure </w:t>
+      </w:r>
+      <w:r>
+        <w:t>member to</w:t>
+      </w:r>
+      <w:r>
+        <w:t xml:space="preserve"> store the measured </w:t>
+      </w:r>
+      <w:proofErr w:type="gramStart"/>
+      <w:r>
+        <w:t xml:space="preserve">temperature,  </w:t>
+      </w:r>
+      <w:r>
+        <w:t xml:space="preserve"> </w:t>
+      </w:r>
+      <w:proofErr w:type="gramEnd"/>
+      <w:r>
+        <w:t xml:space="preserve">                                     </w:t>
+      </w:r>
+      <w:r>
+        <w:t xml:space="preserve">uint32 </w:t>
+      </w:r>
+      <w:proofErr w:type="spellStart"/>
+      <w:r>
+        <w:t>ulTemperatureValue</w:t>
+      </w:r>
+      <w:proofErr w:type="spellEnd"/>
+    </w:p>
+    <w:p>
+      <w:pPr>
+        <w:pStyle w:val="ListParagraph"/>
+        <w:numPr>
+          <w:ilvl w:val="0"/>
+          <w:numId w:val="27"/>
+        </w:numPr>
+      </w:pPr>
+      <w:r>
+        <w:t>Constant that mentions the minimum temperature value the sensor can read,</w:t>
+      </w:r>
+      <w:r>
+        <w:br/>
+        <w:t>SENOR_TEMPERATURE_VALUE_MIN</w:t>
+      </w:r>
+    </w:p>
+    <w:p>
+      <w:pPr>
+        <w:pStyle w:val="ListParagraph"/>
+        <w:numPr>
+          <w:ilvl w:val="0"/>
+          <w:numId w:val="27"/>
+        </w:numPr>
+      </w:pPr>
+      <w:r>
+        <w:lastRenderedPageBreak/>
+        <w:t xml:space="preserve">Constant that </w:t>
+      </w:r>
+      <w:r>
+        <w:t>mentions</w:t>
+      </w:r>
+      <w:r>
+        <w:t xml:space="preserve"> the </w:t>
+      </w:r>
+      <w:r>
+        <w:t>maximum</w:t>
+      </w:r>
+      <w:r>
+        <w:t xml:space="preserve"> temperature value the sensor can read,</w:t>
+      </w:r>
+      <w:r>
+        <w:br/>
+        <w:t>SENOR_TEMPERATURE_VALUE_</w:t>
+      </w:r>
+      <w:r>
+        <w:t>MAX</w:t>
+      </w:r>
+    </w:p>
+    <w:p>
+      <w:pPr>
+        <w:pStyle w:val="ListParagraph"/>
+        <w:ind w:left="1440"/>
+      </w:pPr>
     </w:p>
     <w:p>
       <w:pPr>
@@ -2499,25 +3031,67 @@
         </w:numPr>
       </w:pPr>
       <w:r>
-        <w:t xml:space="preserve">Variable to </w:t>
-      </w:r>
-      <w:r>
-        <w:t>mention</w:t>
-      </w:r>
-      <w:r>
-        <w:t xml:space="preserve"> the temperature threshold level</w:t>
+        <w:t xml:space="preserve">Temperature monitoring module </w:t>
+      </w:r>
+    </w:p>
+    <w:p>
+      <w:pPr>
+        <w:pStyle w:val="ListParagraph"/>
+        <w:numPr>
+          <w:ilvl w:val="0"/>
+          <w:numId w:val="27"/>
+        </w:numPr>
+      </w:pPr>
+      <w:r>
+        <w:t xml:space="preserve">Constant that mentions </w:t>
+      </w:r>
+      <w:r>
+        <w:t>the polling frequency of temperature measurement,</w:t>
+      </w:r>
+    </w:p>
+    <w:p>
+      <w:pPr>
+        <w:pStyle w:val="ListParagraph"/>
+        <w:ind w:left="1440"/>
+      </w:pPr>
+      <w:r>
+        <w:t>TEMPERATURE_MONITORING_POLL_FREQ</w:t>
+      </w:r>
+    </w:p>
+    <w:p>
+      <w:pPr>
+        <w:pStyle w:val="ListParagraph"/>
+        <w:numPr>
+          <w:ilvl w:val="0"/>
+          <w:numId w:val="27"/>
+        </w:numPr>
+      </w:pPr>
+      <w:r>
+        <w:t xml:space="preserve">Constant that mentions </w:t>
+      </w:r>
+      <w:r>
+        <w:t>the temperature threshold level</w:t>
       </w:r>
       <w:r>
         <w:t xml:space="preserve">, </w:t>
       </w:r>
-      <w:r>
-        <w:t xml:space="preserve">uint32 </w:t>
-      </w:r>
-      <w:r>
-        <w:rPr>
-          <w:rFonts w:cs="Calibri"/>
-        </w:rPr>
-        <w:t>ulThresholdValue</w:t>
+    </w:p>
+    <w:p>
+      <w:pPr>
+        <w:pStyle w:val="ListParagraph"/>
+        <w:ind w:left="1440"/>
+      </w:pPr>
+      <w:r>
+        <w:t>TEMPERATURE_</w:t>
+      </w:r>
+      <w:r>
+        <w:t xml:space="preserve"> </w:t>
+      </w:r>
+      <w:r>
+        <w:t>MONITORING</w:t>
+      </w:r>
+      <w:r>
+        <w:t>_THRESHOLD</w:t>
       </w:r>
     </w:p>
     <w:p>
@@ -2529,38 +3103,62 @@
         </w:numPr>
       </w:pPr>
       <w:r>
-        <w:t xml:space="preserve">Variable to mention the alarm on time in case of alarm </w:t>
-      </w:r>
-      <w:r>
-        <w:t>activation,</w:t>
+        <w:t>Alarm manager module</w:t>
       </w:r>
     </w:p>
     <w:p>
       <w:pPr>
         <w:pStyle w:val="ListParagraph"/>
-      </w:pPr>
-      <w:r>
-        <w:t xml:space="preserve"> </w:t>
-      </w:r>
-      <w:r>
-        <w:rPr>
-          <w:rFonts w:cs="Calibri"/>
-        </w:rPr>
-        <w:t>uint8 ucAlarmOnTime</w:t>
+        <w:numPr>
+          <w:ilvl w:val="0"/>
+          <w:numId w:val="27"/>
+        </w:numPr>
+      </w:pPr>
+      <w:r>
+        <w:t>Constant that mentions</w:t>
+      </w:r>
+      <w:r>
+        <w:t xml:space="preserve"> the alarm on time in case of alarm </w:t>
+      </w:r>
+      <w:r>
+        <w:t>activation</w:t>
+      </w:r>
+      <w:r>
+        <w:t>,</w:t>
       </w:r>
     </w:p>
     <w:p>
       <w:pPr>
-        <w:pStyle w:val="Heading2"/>
-      </w:pPr>
-      <w:r>
-        <w:t>5. Error Handling</w:t>
+        <w:pStyle w:val="ListParagraph"/>
+        <w:ind w:firstLine="720"/>
+        <w:rPr>
+          <w:rFonts w:cs="Calibri"/>
+        </w:rPr>
+      </w:pPr>
+      <w:r>
+        <w:t>ALARM_MANAGER_ON_TIME</w:t>
       </w:r>
     </w:p>
     <w:p>
+      <w:pPr>
+        <w:pStyle w:val="Heading2"/>
+      </w:pPr>
+      <w:r>
+        <w:t>5. Error Handling</w:t>
+      </w:r>
+    </w:p>
+    <w:p>
+      <w:pPr>
+        <w:pStyle w:val="ListParagraph"/>
+        <w:numPr>
+          <w:ilvl w:val="0"/>
+          <w:numId w:val="16"/>
+        </w:numPr>
+      </w:pPr>
       <w:r>
         <w:t xml:space="preserve">Verify that the temperature read function always returns a value between the range from </w:t>
       </w:r>
+      <w:proofErr w:type="spellStart"/>
       <w:r>
         <w:rPr>
           <w:i/>
@@ -2568,15 +3166,82 @@
         </w:rPr>
         <w:t>Rmin</w:t>
       </w:r>
+      <w:proofErr w:type="spellEnd"/>
       <w:r>
         <w:t xml:space="preserve"> to </w:t>
       </w:r>
+      <w:proofErr w:type="spellStart"/>
       <w:r>
         <w:rPr>
           <w:i/>
           <w:iCs/>
         </w:rPr>
         <w:t>Rmax</w:t>
+      </w:r>
+      <w:proofErr w:type="spellEnd"/>
+      <w:r>
+        <w:t>.</w:t>
+      </w:r>
+    </w:p>
+    <w:p>
+      <w:pPr>
+        <w:pStyle w:val="ListParagraph"/>
+        <w:numPr>
+          <w:ilvl w:val="0"/>
+          <w:numId w:val="16"/>
+        </w:numPr>
+      </w:pPr>
+      <w:r>
+        <w:t>Ensure that the alarm will be turned on if and only if the measured temperature is above the threshold level</w:t>
+      </w:r>
+      <w:r>
+        <w:t>.</w:t>
+      </w:r>
+    </w:p>
+    <w:p>
+      <w:pPr>
+        <w:pStyle w:val="ListParagraph"/>
+        <w:numPr>
+          <w:ilvl w:val="0"/>
+          <w:numId w:val="16"/>
+        </w:numPr>
+      </w:pPr>
+      <w:r>
+        <w:t xml:space="preserve">Ensure that the alarm must be turned off after </w:t>
+      </w:r>
+      <w:proofErr w:type="gramStart"/>
+      <w:r>
+        <w:t>the n</w:t>
+      </w:r>
+      <w:proofErr w:type="gramEnd"/>
+      <w:r>
+        <w:t xml:space="preserve"> second once it </w:t>
+      </w:r>
+      <w:proofErr w:type="gramStart"/>
+      <w:r>
+        <w:t>activated</w:t>
+      </w:r>
+      <w:proofErr w:type="gramEnd"/>
+      <w:r>
+        <w:t>.</w:t>
+      </w:r>
+    </w:p>
+    <w:p>
+      <w:pPr>
+        <w:pStyle w:val="ListParagraph"/>
+        <w:numPr>
+          <w:ilvl w:val="0"/>
+          <w:numId w:val="16"/>
+        </w:numPr>
+      </w:pPr>
+      <w:r>
+        <w:t xml:space="preserve">Verify that if the sensor module is not working properly the sensor module will return a value that </w:t>
+      </w:r>
+      <w:r>
+        <w:t>indicates</w:t>
+      </w:r>
+      <w:r>
+        <w:t xml:space="preserve"> the sensor error</w:t>
       </w:r>
       <w:r>
         <w:t>.</w:t>
@@ -2599,6 +3264,7 @@
           <w:numId w:val="15"/>
         </w:numPr>
       </w:pPr>
+      <w:proofErr w:type="gramStart"/>
       <w:r>
         <w:rPr>
           <w:i/>
@@ -2607,7 +3273,30 @@
         <w:t xml:space="preserve">p </w:t>
       </w:r>
       <w:r>
-        <w:t xml:space="preserve">: Polling frequency, the frequency at which temperature is measured. </w:t>
+        <w:t>:</w:t>
+      </w:r>
+      <w:proofErr w:type="gramEnd"/>
+      <w:r>
+        <w:t xml:space="preserve"> Polling frequency, the frequency at which temperature is measured.</w:t>
+      </w:r>
+      <w:r>
+        <w:t xml:space="preserve"> The temperature must be </w:t>
+      </w:r>
+      <w:proofErr w:type="gramStart"/>
+      <w:r>
+        <w:t>read in</w:t>
+      </w:r>
+      <w:proofErr w:type="gramEnd"/>
+      <w:r>
+        <w:t xml:space="preserve"> </w:t>
+      </w:r>
+      <w:proofErr w:type="gramStart"/>
+      <w:r>
+        <w:t>every p</w:t>
+      </w:r>
+      <w:proofErr w:type="gramEnd"/>
+      <w:r>
+        <w:t xml:space="preserve"> second to ensure the performance criteria.</w:t>
       </w:r>
     </w:p>
     <w:p>
@@ -2618,6 +3307,7 @@
           <w:numId w:val="15"/>
         </w:numPr>
       </w:pPr>
+      <w:proofErr w:type="gramStart"/>
       <w:r>
         <w:rPr>
           <w:i/>
@@ -2626,7 +3316,26 @@
         <w:t xml:space="preserve">t  </w:t>
       </w:r>
       <w:r>
-        <w:t xml:space="preserve">: Temperature threshold level, if the measured temperature is above this value alarm will be activated. </w:t>
+        <w:t>:</w:t>
+      </w:r>
+      <w:proofErr w:type="gramEnd"/>
+      <w:r>
+        <w:t xml:space="preserve"> Temperature threshold level, if the measured temperature is above this value alarm will be activated. </w:t>
+      </w:r>
+      <w:r>
+        <w:t xml:space="preserve">The alarm will be activated if and only if the </w:t>
+      </w:r>
+      <w:r>
+        <w:t>measured temperature is above</w:t>
+      </w:r>
+      <w:r>
+        <w:t xml:space="preserve"> the </w:t>
+      </w:r>
+      <w:r>
+        <w:t>threshold level</w:t>
+      </w:r>
+      <w:r>
+        <w:t>.</w:t>
       </w:r>
     </w:p>
     <w:p>
@@ -2637,15 +3346,33 @@
           <w:numId w:val="15"/>
         </w:numPr>
       </w:pPr>
+      <w:proofErr w:type="gramStart"/>
       <w:r>
         <w:rPr>
           <w:i/>
           <w:iCs/>
         </w:rPr>
-        <w:t>n : Alarm on time, if the measured temperature is above temperature threshold level alarm will</w:t>
-      </w:r>
-      <w:r>
-        <w:t xml:space="preserve"> be activated for w seconds.</w:t>
+        <w:t>n :</w:t>
+      </w:r>
+      <w:proofErr w:type="gramEnd"/>
+      <w:r>
+        <w:rPr>
+          <w:i/>
+          <w:iCs/>
+        </w:rPr>
+        <w:t xml:space="preserve"> Alarm on time, if the measured temperature is above temperature threshold level alarm will</w:t>
+      </w:r>
+      <w:r>
+        <w:t xml:space="preserve"> be activated for </w:t>
+      </w:r>
+      <w:r>
+        <w:t>n</w:t>
+      </w:r>
+      <w:r>
+        <w:t xml:space="preserve"> seconds.</w:t>
+      </w:r>
+      <w:r>
+        <w:t xml:space="preserve"> Alarm must be deactivated after n seconds.</w:t>
       </w:r>
     </w:p>
     <w:p>
@@ -2656,6 +3383,8 @@
           <w:numId w:val="15"/>
         </w:numPr>
       </w:pPr>
+      <w:proofErr w:type="spellStart"/>
+      <w:proofErr w:type="gramStart"/>
       <w:r>
         <w:rPr>
           <w:i/>
@@ -2663,8 +3392,24 @@
         </w:rPr>
         <w:t>Rmin</w:t>
       </w:r>
-      <w:r>
-        <w:t xml:space="preserve"> : The minimum temperature the sensor can detect.</w:t>
+      <w:proofErr w:type="spellEnd"/>
+      <w:r>
+        <w:t xml:space="preserve"> :</w:t>
+      </w:r>
+      <w:proofErr w:type="gramEnd"/>
+      <w:r>
+        <w:t xml:space="preserve"> The minimum temperature the sensor can detect.</w:t>
+      </w:r>
+      <w:r>
+        <w:t xml:space="preserve"> The temperature value at any point cannot be below the </w:t>
+      </w:r>
+      <w:proofErr w:type="spellStart"/>
+      <w:r>
+        <w:t>Rmin</w:t>
+      </w:r>
+      <w:proofErr w:type="spellEnd"/>
+      <w:r>
+        <w:t xml:space="preserve"> value.</w:t>
       </w:r>
     </w:p>
     <w:p>
@@ -2675,8 +3420,36 @@
           <w:numId w:val="15"/>
         </w:numPr>
       </w:pPr>
-      <w:r>
-        <w:t>Rmax: The maximum temperature the sensor can detect.</w:t>
+      <w:proofErr w:type="spellStart"/>
+      <w:r>
+        <w:t>Rmax</w:t>
+      </w:r>
+      <w:proofErr w:type="spellEnd"/>
+      <w:r>
+        <w:t>: The maximum temperature the sensor can detect.</w:t>
+      </w:r>
+      <w:r>
+        <w:t xml:space="preserve"> </w:t>
+      </w:r>
+      <w:r>
+        <w:t xml:space="preserve">The temperature value at any point cannot be </w:t>
+      </w:r>
+      <w:r>
+        <w:t>above</w:t>
+      </w:r>
+      <w:r>
+        <w:t xml:space="preserve"> the </w:t>
+      </w:r>
+      <w:proofErr w:type="spellStart"/>
+      <w:r>
+        <w:t>Rmax</w:t>
+      </w:r>
+      <w:proofErr w:type="spellEnd"/>
+      <w:r>
+        <w:t xml:space="preserve"> </w:t>
+      </w:r>
+      <w:r>
+        <w:t>value.</w:t>
       </w:r>
     </w:p>
     <w:p>
@@ -2699,6 +3472,7 @@
       <w:r>
         <w:t xml:space="preserve">Verify that the temperature read function always returns a value between the range from </w:t>
       </w:r>
+      <w:proofErr w:type="spellStart"/>
       <w:r>
         <w:rPr>
           <w:i/>
@@ -2706,9 +3480,11 @@
         </w:rPr>
         <w:t>Rmin</w:t>
       </w:r>
+      <w:proofErr w:type="spellEnd"/>
       <w:r>
         <w:t xml:space="preserve"> to </w:t>
       </w:r>
+      <w:proofErr w:type="spellStart"/>
       <w:r>
         <w:rPr>
           <w:i/>
@@ -2716,6 +3492,7 @@
         </w:rPr>
         <w:t>Rmax</w:t>
       </w:r>
+      <w:proofErr w:type="spellEnd"/>
       <w:r>
         <w:t>. Test the system for temperature below the threshold level and ensure that the alarm is not triggered.</w:t>
       </w:r>
@@ -2743,6 +3520,7 @@
         <w:spacing w:after="160" w:line="259" w:lineRule="auto"/>
       </w:pPr>
       <w:r>
+        <w:lastRenderedPageBreak/>
         <w:t xml:space="preserve">Test the system for temperature above the threshold level and ensure that the alarm is triggered for </w:t>
       </w:r>
       <w:r>
@@ -2780,7 +3558,6 @@
         <w:pStyle w:val="Heading2"/>
       </w:pPr>
       <w:r>
-        <w:lastRenderedPageBreak/>
         <w:t>8. Traceability</w:t>
       </w:r>
     </w:p>
@@ -2793,7 +3570,33 @@
         <w:spacing w:after="160" w:line="278" w:lineRule="auto"/>
       </w:pPr>
       <w:r>
-        <w:t xml:space="preserve">Requirement: Read temperature every </w:t>
+        <w:t>Requirement</w:t>
+      </w:r>
+      <w:r>
+        <w:t xml:space="preserve"> mentioned in SRS section </w:t>
+      </w:r>
+      <w:bookmarkStart w:id="0" w:name="_Toc138066810"/>
+      <w:r>
+        <w:rPr>
+          <w:lang w:val="en-IN"/>
+        </w:rPr>
+        <w:t>2.1 Functional requirement 1</w:t>
+      </w:r>
+      <w:bookmarkEnd w:id="0"/>
+      <w:r>
+        <w:rPr>
+          <w:lang w:val="en-IN"/>
+        </w:rPr>
+        <w:t>:</w:t>
+      </w:r>
+    </w:p>
+    <w:p>
+      <w:pPr>
+        <w:spacing w:after="160" w:line="278" w:lineRule="auto"/>
+        <w:ind w:left="720"/>
+      </w:pPr>
+      <w:r>
+        <w:t xml:space="preserve"> Read temperature every </w:t>
       </w:r>
       <w:r>
         <w:t>p</w:t>
@@ -2807,27 +3610,48 @@
       <w:r>
         <w:t xml:space="preserve"> → </w:t>
       </w:r>
+      <w:proofErr w:type="spellStart"/>
       <w:r>
         <w:t>t</w:t>
       </w:r>
       <w:r>
         <w:t>emperatureMonitoringThreadCreate</w:t>
       </w:r>
+      <w:proofErr w:type="spellEnd"/>
       <w:r>
         <w:t xml:space="preserve"> </w:t>
       </w:r>
       <w:r>
-        <w:t>()</w:t>
+        <w:t>(</w:t>
+      </w:r>
+      <w:r>
+        <w:t>void</w:t>
+      </w:r>
+      <w:r>
+        <w:t>)</w:t>
       </w:r>
       <w:r>
         <w:t xml:space="preserve">, </w:t>
       </w:r>
+      <w:proofErr w:type="spellStart"/>
       <w:r>
         <w:t>alarmManagerReadData</w:t>
       </w:r>
-      <w:r>
-        <w:t>()</w:t>
-      </w:r>
+      <w:proofErr w:type="spellEnd"/>
+      <w:r>
+        <w:t>(</w:t>
+      </w:r>
+      <w:r>
+        <w:t>void</w:t>
+      </w:r>
+      <w:proofErr w:type="gramStart"/>
+      <w:r>
+        <w:t>)</w:t>
+      </w:r>
+      <w:r>
+        <w:t>;</w:t>
+      </w:r>
+      <w:proofErr w:type="gramEnd"/>
     </w:p>
     <w:p>
       <w:pPr>
@@ -2838,17 +3662,93 @@
         <w:spacing w:after="160" w:line="278" w:lineRule="auto"/>
       </w:pPr>
       <w:r>
-        <w:t xml:space="preserve">Requirement: Compare with threshold → </w:t>
-      </w:r>
+        <w:t>Requirement</w:t>
+      </w:r>
+      <w:r>
+        <w:t xml:space="preserve"> mentioned in SRS section </w:t>
+      </w:r>
+      <w:r>
+        <w:rPr>
+          <w:lang w:val="en-IN"/>
+        </w:rPr>
+        <w:t>2.</w:t>
+      </w:r>
+      <w:r>
+        <w:rPr>
+          <w:lang w:val="en-IN"/>
+        </w:rPr>
+        <w:t>2</w:t>
+      </w:r>
+      <w:r>
+        <w:rPr>
+          <w:lang w:val="en-IN"/>
+        </w:rPr>
+        <w:t xml:space="preserve"> Functional requirement 1:</w:t>
+      </w:r>
+    </w:p>
+    <w:p>
+      <w:pPr>
+        <w:ind w:firstLine="720"/>
+      </w:pPr>
+      <w:r>
+        <w:t xml:space="preserve">Compare with threshold → </w:t>
+      </w:r>
+      <w:proofErr w:type="spellStart"/>
       <w:r>
         <w:t>alarmManagerCompareData</w:t>
       </w:r>
+      <w:proofErr w:type="spellEnd"/>
       <w:r>
         <w:t xml:space="preserve"> </w:t>
       </w:r>
       <w:r>
-        <w:t>()</w:t>
-      </w:r>
+        <w:t>(</w:t>
+      </w:r>
+      <w:r>
+        <w:t xml:space="preserve">uint32 </w:t>
+      </w:r>
+      <w:proofErr w:type="spellStart"/>
+      <w:r>
+        <w:rPr>
+          <w:rFonts w:cs="Calibri"/>
+        </w:rPr>
+        <w:t>ulTemperatureValue</w:t>
+      </w:r>
+      <w:proofErr w:type="spellEnd"/>
+      <w:r>
+        <w:rPr>
+          <w:rFonts w:cs="Calibri"/>
+        </w:rPr>
+        <w:t xml:space="preserve">, </w:t>
+      </w:r>
+    </w:p>
+    <w:p>
+      <w:pPr>
+        <w:spacing w:after="160" w:line="278" w:lineRule="auto"/>
+        <w:ind w:left="720"/>
+      </w:pPr>
+      <w:r>
+        <w:rPr>
+          <w:rFonts w:cs="Calibri"/>
+        </w:rPr>
+        <w:t xml:space="preserve">                                                              uint32 </w:t>
+      </w:r>
+      <w:proofErr w:type="spellStart"/>
+      <w:r>
+        <w:rPr>
+          <w:rFonts w:cs="Calibri"/>
+        </w:rPr>
+        <w:t>ulThresholdValue</w:t>
+      </w:r>
+      <w:proofErr w:type="spellEnd"/>
+      <w:proofErr w:type="gramStart"/>
+      <w:r>
+        <w:t>)</w:t>
+      </w:r>
+      <w:r>
+        <w:t>;</w:t>
+      </w:r>
+      <w:proofErr w:type="gramEnd"/>
     </w:p>
     <w:p>
       <w:pPr>
@@ -2859,7 +3759,37 @@
         <w:spacing w:after="160" w:line="278" w:lineRule="auto"/>
       </w:pPr>
       <w:r>
-        <w:t xml:space="preserve">Requirement: Activate alarm for </w:t>
+        <w:t>Requirement</w:t>
+      </w:r>
+      <w:r>
+        <w:t xml:space="preserve"> mentioned in SRS section </w:t>
+      </w:r>
+      <w:r>
+        <w:rPr>
+          <w:lang w:val="en-IN"/>
+        </w:rPr>
+        <w:t>2.</w:t>
+      </w:r>
+      <w:r>
+        <w:rPr>
+          <w:lang w:val="en-IN"/>
+        </w:rPr>
+        <w:t>2</w:t>
+      </w:r>
+      <w:r>
+        <w:rPr>
+          <w:lang w:val="en-IN"/>
+        </w:rPr>
+        <w:t xml:space="preserve"> Functional requirement 1:</w:t>
+      </w:r>
+    </w:p>
+    <w:p>
+      <w:pPr>
+        <w:spacing w:after="160" w:line="278" w:lineRule="auto"/>
+        <w:ind w:left="720"/>
+      </w:pPr>
+      <w:r>
+        <w:t xml:space="preserve">Activate alarm for </w:t>
       </w:r>
       <w:r>
         <w:t>n</w:t>
@@ -2867,15 +3797,39 @@
       <w:r>
         <w:t xml:space="preserve"> sec → </w:t>
       </w:r>
+      <w:proofErr w:type="spellStart"/>
       <w:r>
         <w:t>alarmManagerAlarmOn</w:t>
       </w:r>
+      <w:proofErr w:type="spellEnd"/>
       <w:r>
         <w:t xml:space="preserve"> </w:t>
       </w:r>
       <w:r>
-        <w:t>()</w:t>
-      </w:r>
+        <w:t>(</w:t>
+      </w:r>
+      <w:r>
+        <w:rPr>
+          <w:rFonts w:cs="Calibri"/>
+        </w:rPr>
+        <w:t xml:space="preserve">uint8 </w:t>
+      </w:r>
+      <w:proofErr w:type="spellStart"/>
+      <w:r>
+        <w:rPr>
+          <w:rFonts w:cs="Calibri"/>
+        </w:rPr>
+        <w:t>ucAlarmOnTime</w:t>
+      </w:r>
+      <w:proofErr w:type="spellEnd"/>
+      <w:proofErr w:type="gramStart"/>
+      <w:r>
+        <w:t>)</w:t>
+      </w:r>
+      <w:r>
+        <w:t>;</w:t>
+      </w:r>
+      <w:proofErr w:type="gramEnd"/>
     </w:p>
     <w:p/>
     <w:sectPr>
@@ -3175,6 +4129,119 @@
     </w:lvl>
   </w:abstractNum>
   <w:abstractNum w:abstractNumId="10" w15:restartNumberingAfterBreak="0">
+    <w:nsid w:val="127C5C6A"/>
+    <w:multiLevelType w:val="hybridMultilevel"/>
+    <w:tmpl w:val="278A59A2"/>
+    <w:lvl w:ilvl="0" w:tplc="40090003">
+      <w:start w:val="1"/>
+      <w:numFmt w:val="bullet"/>
+      <w:lvlText w:val="o"/>
+      <w:lvlJc w:val="left"/>
+      <w:pPr>
+        <w:ind w:left="1446" w:hanging="360"/>
+      </w:pPr>
+      <w:rPr>
+        <w:rFonts w:ascii="Courier New" w:hAnsi="Courier New" w:cs="Courier New" w:hint="default"/>
+      </w:rPr>
+    </w:lvl>
+    <w:lvl w:ilvl="1" w:tplc="40090003" w:tentative="1">
+      <w:start w:val="1"/>
+      <w:numFmt w:val="bullet"/>
+      <w:lvlText w:val="o"/>
+      <w:lvlJc w:val="left"/>
+      <w:pPr>
+        <w:ind w:left="2166" w:hanging="360"/>
+      </w:pPr>
+      <w:rPr>
+        <w:rFonts w:ascii="Courier New" w:hAnsi="Courier New" w:cs="Courier New" w:hint="default"/>
+      </w:rPr>
+    </w:lvl>
+    <w:lvl w:ilvl="2" w:tplc="40090005" w:tentative="1">
+      <w:start w:val="1"/>
+      <w:numFmt w:val="bullet"/>
+      <w:lvlText w:val=""/>
+      <w:lvlJc w:val="left"/>
+      <w:pPr>
+        <w:ind w:left="2886" w:hanging="360"/>
+      </w:pPr>
+      <w:rPr>
+        <w:rFonts w:ascii="Wingdings" w:hAnsi="Wingdings" w:hint="default"/>
+      </w:rPr>
+    </w:lvl>
+    <w:lvl w:ilvl="3" w:tplc="40090001" w:tentative="1">
+      <w:start w:val="1"/>
+      <w:numFmt w:val="bullet"/>
+      <w:lvlText w:val=""/>
+      <w:lvlJc w:val="left"/>
+      <w:pPr>
+        <w:ind w:left="3606" w:hanging="360"/>
+      </w:pPr>
+      <w:rPr>
+        <w:rFonts w:ascii="Symbol" w:hAnsi="Symbol" w:hint="default"/>
+      </w:rPr>
+    </w:lvl>
+    <w:lvl w:ilvl="4" w:tplc="40090003" w:tentative="1">
+      <w:start w:val="1"/>
+      <w:numFmt w:val="bullet"/>
+      <w:lvlText w:val="o"/>
+      <w:lvlJc w:val="left"/>
+      <w:pPr>
+        <w:ind w:left="4326" w:hanging="360"/>
+      </w:pPr>
+      <w:rPr>
+        <w:rFonts w:ascii="Courier New" w:hAnsi="Courier New" w:cs="Courier New" w:hint="default"/>
+      </w:rPr>
+    </w:lvl>
+    <w:lvl w:ilvl="5" w:tplc="40090005" w:tentative="1">
+      <w:start w:val="1"/>
+      <w:numFmt w:val="bullet"/>
+      <w:lvlText w:val=""/>
+      <w:lvlJc w:val="left"/>
+      <w:pPr>
+        <w:ind w:left="5046" w:hanging="360"/>
+      </w:pPr>
+      <w:rPr>
+        <w:rFonts w:ascii="Wingdings" w:hAnsi="Wingdings" w:hint="default"/>
+      </w:rPr>
+    </w:lvl>
+    <w:lvl w:ilvl="6" w:tplc="40090001" w:tentative="1">
+      <w:start w:val="1"/>
+      <w:numFmt w:val="bullet"/>
+      <w:lvlText w:val=""/>
+      <w:lvlJc w:val="left"/>
+      <w:pPr>
+        <w:ind w:left="5766" w:hanging="360"/>
+      </w:pPr>
+      <w:rPr>
+        <w:rFonts w:ascii="Symbol" w:hAnsi="Symbol" w:hint="default"/>
+      </w:rPr>
+    </w:lvl>
+    <w:lvl w:ilvl="7" w:tplc="40090003" w:tentative="1">
+      <w:start w:val="1"/>
+      <w:numFmt w:val="bullet"/>
+      <w:lvlText w:val="o"/>
+      <w:lvlJc w:val="left"/>
+      <w:pPr>
+        <w:ind w:left="6486" w:hanging="360"/>
+      </w:pPr>
+      <w:rPr>
+        <w:rFonts w:ascii="Courier New" w:hAnsi="Courier New" w:cs="Courier New" w:hint="default"/>
+      </w:rPr>
+    </w:lvl>
+    <w:lvl w:ilvl="8" w:tplc="40090005" w:tentative="1">
+      <w:start w:val="1"/>
+      <w:numFmt w:val="bullet"/>
+      <w:lvlText w:val=""/>
+      <w:lvlJc w:val="left"/>
+      <w:pPr>
+        <w:ind w:left="7206" w:hanging="360"/>
+      </w:pPr>
+      <w:rPr>
+        <w:rFonts w:ascii="Wingdings" w:hAnsi="Wingdings" w:hint="default"/>
+      </w:rPr>
+    </w:lvl>
+  </w:abstractNum>
+  <w:abstractNum w:abstractNumId="11" w15:restartNumberingAfterBreak="0">
     <w:nsid w:val="14150F35"/>
     <w:multiLevelType w:val="hybridMultilevel"/>
     <w:tmpl w:val="1182EF9C"/>
@@ -3287,10 +4354,10 @@
       </w:rPr>
     </w:lvl>
   </w:abstractNum>
-  <w:abstractNum w:abstractNumId="11" w15:restartNumberingAfterBreak="0">
+  <w:abstractNum w:abstractNumId="12" w15:restartNumberingAfterBreak="0">
     <w:nsid w:val="189D629E"/>
     <w:multiLevelType w:val="hybridMultilevel"/>
-    <w:tmpl w:val="48E27B1C"/>
+    <w:tmpl w:val="7A0C8BA6"/>
     <w:lvl w:ilvl="0" w:tplc="40090001">
       <w:start w:val="1"/>
       <w:numFmt w:val="bullet"/>
@@ -3303,7 +4370,7 @@
         <w:rFonts w:ascii="Symbol" w:hAnsi="Symbol" w:hint="default"/>
       </w:rPr>
     </w:lvl>
-    <w:lvl w:ilvl="1" w:tplc="40090003" w:tentative="1">
+    <w:lvl w:ilvl="1" w:tplc="40090003">
       <w:start w:val="1"/>
       <w:numFmt w:val="bullet"/>
       <w:lvlText w:val="o"/>
@@ -3400,7 +4467,7 @@
       </w:rPr>
     </w:lvl>
   </w:abstractNum>
-  <w:abstractNum w:abstractNumId="12" w15:restartNumberingAfterBreak="0">
+  <w:abstractNum w:abstractNumId="13" w15:restartNumberingAfterBreak="0">
     <w:nsid w:val="199C23BB"/>
     <w:multiLevelType w:val="hybridMultilevel"/>
     <w:tmpl w:val="2646A5DA"/>
@@ -3513,10 +4580,10 @@
       </w:rPr>
     </w:lvl>
   </w:abstractNum>
-  <w:abstractNum w:abstractNumId="13" w15:restartNumberingAfterBreak="0">
+  <w:abstractNum w:abstractNumId="14" w15:restartNumberingAfterBreak="0">
     <w:nsid w:val="35530087"/>
     <w:multiLevelType w:val="hybridMultilevel"/>
-    <w:tmpl w:val="FF4E0BCA"/>
+    <w:tmpl w:val="38BAA1CC"/>
     <w:lvl w:ilvl="0" w:tplc="40090001">
       <w:start w:val="1"/>
       <w:numFmt w:val="bullet"/>
@@ -3626,7 +4693,7 @@
       </w:rPr>
     </w:lvl>
   </w:abstractNum>
-  <w:abstractNum w:abstractNumId="14" w15:restartNumberingAfterBreak="0">
+  <w:abstractNum w:abstractNumId="15" w15:restartNumberingAfterBreak="0">
     <w:nsid w:val="46876299"/>
     <w:multiLevelType w:val="multilevel"/>
     <w:tmpl w:val="BF9E84DE"/>
@@ -3775,7 +4842,120 @@
       </w:rPr>
     </w:lvl>
   </w:abstractNum>
-  <w:abstractNum w:abstractNumId="15" w15:restartNumberingAfterBreak="0">
+  <w:abstractNum w:abstractNumId="16" w15:restartNumberingAfterBreak="0">
+    <w:nsid w:val="49F7562C"/>
+    <w:multiLevelType w:val="hybridMultilevel"/>
+    <w:tmpl w:val="DC88CAB6"/>
+    <w:lvl w:ilvl="0" w:tplc="40090003">
+      <w:start w:val="1"/>
+      <w:numFmt w:val="bullet"/>
+      <w:lvlText w:val="o"/>
+      <w:lvlJc w:val="left"/>
+      <w:pPr>
+        <w:ind w:left="2160" w:hanging="360"/>
+      </w:pPr>
+      <w:rPr>
+        <w:rFonts w:ascii="Courier New" w:hAnsi="Courier New" w:cs="Courier New" w:hint="default"/>
+      </w:rPr>
+    </w:lvl>
+    <w:lvl w:ilvl="1" w:tplc="40090003" w:tentative="1">
+      <w:start w:val="1"/>
+      <w:numFmt w:val="bullet"/>
+      <w:lvlText w:val="o"/>
+      <w:lvlJc w:val="left"/>
+      <w:pPr>
+        <w:ind w:left="2880" w:hanging="360"/>
+      </w:pPr>
+      <w:rPr>
+        <w:rFonts w:ascii="Courier New" w:hAnsi="Courier New" w:cs="Courier New" w:hint="default"/>
+      </w:rPr>
+    </w:lvl>
+    <w:lvl w:ilvl="2" w:tplc="40090005" w:tentative="1">
+      <w:start w:val="1"/>
+      <w:numFmt w:val="bullet"/>
+      <w:lvlText w:val=""/>
+      <w:lvlJc w:val="left"/>
+      <w:pPr>
+        <w:ind w:left="3600" w:hanging="360"/>
+      </w:pPr>
+      <w:rPr>
+        <w:rFonts w:ascii="Wingdings" w:hAnsi="Wingdings" w:hint="default"/>
+      </w:rPr>
+    </w:lvl>
+    <w:lvl w:ilvl="3" w:tplc="40090001" w:tentative="1">
+      <w:start w:val="1"/>
+      <w:numFmt w:val="bullet"/>
+      <w:lvlText w:val=""/>
+      <w:lvlJc w:val="left"/>
+      <w:pPr>
+        <w:ind w:left="4320" w:hanging="360"/>
+      </w:pPr>
+      <w:rPr>
+        <w:rFonts w:ascii="Symbol" w:hAnsi="Symbol" w:hint="default"/>
+      </w:rPr>
+    </w:lvl>
+    <w:lvl w:ilvl="4" w:tplc="40090003" w:tentative="1">
+      <w:start w:val="1"/>
+      <w:numFmt w:val="bullet"/>
+      <w:lvlText w:val="o"/>
+      <w:lvlJc w:val="left"/>
+      <w:pPr>
+        <w:ind w:left="5040" w:hanging="360"/>
+      </w:pPr>
+      <w:rPr>
+        <w:rFonts w:ascii="Courier New" w:hAnsi="Courier New" w:cs="Courier New" w:hint="default"/>
+      </w:rPr>
+    </w:lvl>
+    <w:lvl w:ilvl="5" w:tplc="40090005" w:tentative="1">
+      <w:start w:val="1"/>
+      <w:numFmt w:val="bullet"/>
+      <w:lvlText w:val=""/>
+      <w:lvlJc w:val="left"/>
+      <w:pPr>
+        <w:ind w:left="5760" w:hanging="360"/>
+      </w:pPr>
+      <w:rPr>
+        <w:rFonts w:ascii="Wingdings" w:hAnsi="Wingdings" w:hint="default"/>
+      </w:rPr>
+    </w:lvl>
+    <w:lvl w:ilvl="6" w:tplc="40090001" w:tentative="1">
+      <w:start w:val="1"/>
+      <w:numFmt w:val="bullet"/>
+      <w:lvlText w:val=""/>
+      <w:lvlJc w:val="left"/>
+      <w:pPr>
+        <w:ind w:left="6480" w:hanging="360"/>
+      </w:pPr>
+      <w:rPr>
+        <w:rFonts w:ascii="Symbol" w:hAnsi="Symbol" w:hint="default"/>
+      </w:rPr>
+    </w:lvl>
+    <w:lvl w:ilvl="7" w:tplc="40090003" w:tentative="1">
+      <w:start w:val="1"/>
+      <w:numFmt w:val="bullet"/>
+      <w:lvlText w:val="o"/>
+      <w:lvlJc w:val="left"/>
+      <w:pPr>
+        <w:ind w:left="7200" w:hanging="360"/>
+      </w:pPr>
+      <w:rPr>
+        <w:rFonts w:ascii="Courier New" w:hAnsi="Courier New" w:cs="Courier New" w:hint="default"/>
+      </w:rPr>
+    </w:lvl>
+    <w:lvl w:ilvl="8" w:tplc="40090005" w:tentative="1">
+      <w:start w:val="1"/>
+      <w:numFmt w:val="bullet"/>
+      <w:lvlText w:val=""/>
+      <w:lvlJc w:val="left"/>
+      <w:pPr>
+        <w:ind w:left="7920" w:hanging="360"/>
+      </w:pPr>
+      <w:rPr>
+        <w:rFonts w:ascii="Wingdings" w:hAnsi="Wingdings" w:hint="default"/>
+      </w:rPr>
+    </w:lvl>
+  </w:abstractNum>
+  <w:abstractNum w:abstractNumId="17" w15:restartNumberingAfterBreak="0">
     <w:nsid w:val="4BB65640"/>
     <w:multiLevelType w:val="hybridMultilevel"/>
     <w:tmpl w:val="A3FC974E"/>
@@ -3888,7 +5068,608 @@
       </w:rPr>
     </w:lvl>
   </w:abstractNum>
-  <w:abstractNum w:abstractNumId="16" w15:restartNumberingAfterBreak="0">
+  <w:abstractNum w:abstractNumId="18" w15:restartNumberingAfterBreak="0">
+    <w:nsid w:val="4FA813F0"/>
+    <w:multiLevelType w:val="hybridMultilevel"/>
+    <w:tmpl w:val="162CECD0"/>
+    <w:lvl w:ilvl="0" w:tplc="40090003">
+      <w:start w:val="1"/>
+      <w:numFmt w:val="bullet"/>
+      <w:lvlText w:val="o"/>
+      <w:lvlJc w:val="left"/>
+      <w:pPr>
+        <w:ind w:left="1440" w:hanging="360"/>
+      </w:pPr>
+      <w:rPr>
+        <w:rFonts w:ascii="Courier New" w:hAnsi="Courier New" w:cs="Courier New" w:hint="default"/>
+      </w:rPr>
+    </w:lvl>
+    <w:lvl w:ilvl="1" w:tplc="40090003" w:tentative="1">
+      <w:start w:val="1"/>
+      <w:numFmt w:val="bullet"/>
+      <w:lvlText w:val="o"/>
+      <w:lvlJc w:val="left"/>
+      <w:pPr>
+        <w:ind w:left="2160" w:hanging="360"/>
+      </w:pPr>
+      <w:rPr>
+        <w:rFonts w:ascii="Courier New" w:hAnsi="Courier New" w:cs="Courier New" w:hint="default"/>
+      </w:rPr>
+    </w:lvl>
+    <w:lvl w:ilvl="2" w:tplc="40090005" w:tentative="1">
+      <w:start w:val="1"/>
+      <w:numFmt w:val="bullet"/>
+      <w:lvlText w:val=""/>
+      <w:lvlJc w:val="left"/>
+      <w:pPr>
+        <w:ind w:left="2880" w:hanging="360"/>
+      </w:pPr>
+      <w:rPr>
+        <w:rFonts w:ascii="Wingdings" w:hAnsi="Wingdings" w:hint="default"/>
+      </w:rPr>
+    </w:lvl>
+    <w:lvl w:ilvl="3" w:tplc="40090001" w:tentative="1">
+      <w:start w:val="1"/>
+      <w:numFmt w:val="bullet"/>
+      <w:lvlText w:val=""/>
+      <w:lvlJc w:val="left"/>
+      <w:pPr>
+        <w:ind w:left="3600" w:hanging="360"/>
+      </w:pPr>
+      <w:rPr>
+        <w:rFonts w:ascii="Symbol" w:hAnsi="Symbol" w:hint="default"/>
+      </w:rPr>
+    </w:lvl>
+    <w:lvl w:ilvl="4" w:tplc="40090003" w:tentative="1">
+      <w:start w:val="1"/>
+      <w:numFmt w:val="bullet"/>
+      <w:lvlText w:val="o"/>
+      <w:lvlJc w:val="left"/>
+      <w:pPr>
+        <w:ind w:left="4320" w:hanging="360"/>
+      </w:pPr>
+      <w:rPr>
+        <w:rFonts w:ascii="Courier New" w:hAnsi="Courier New" w:cs="Courier New" w:hint="default"/>
+      </w:rPr>
+    </w:lvl>
+    <w:lvl w:ilvl="5" w:tplc="40090005" w:tentative="1">
+      <w:start w:val="1"/>
+      <w:numFmt w:val="bullet"/>
+      <w:lvlText w:val=""/>
+      <w:lvlJc w:val="left"/>
+      <w:pPr>
+        <w:ind w:left="5040" w:hanging="360"/>
+      </w:pPr>
+      <w:rPr>
+        <w:rFonts w:ascii="Wingdings" w:hAnsi="Wingdings" w:hint="default"/>
+      </w:rPr>
+    </w:lvl>
+    <w:lvl w:ilvl="6" w:tplc="40090001" w:tentative="1">
+      <w:start w:val="1"/>
+      <w:numFmt w:val="bullet"/>
+      <w:lvlText w:val=""/>
+      <w:lvlJc w:val="left"/>
+      <w:pPr>
+        <w:ind w:left="5760" w:hanging="360"/>
+      </w:pPr>
+      <w:rPr>
+        <w:rFonts w:ascii="Symbol" w:hAnsi="Symbol" w:hint="default"/>
+      </w:rPr>
+    </w:lvl>
+    <w:lvl w:ilvl="7" w:tplc="40090003" w:tentative="1">
+      <w:start w:val="1"/>
+      <w:numFmt w:val="bullet"/>
+      <w:lvlText w:val="o"/>
+      <w:lvlJc w:val="left"/>
+      <w:pPr>
+        <w:ind w:left="6480" w:hanging="360"/>
+      </w:pPr>
+      <w:rPr>
+        <w:rFonts w:ascii="Courier New" w:hAnsi="Courier New" w:cs="Courier New" w:hint="default"/>
+      </w:rPr>
+    </w:lvl>
+    <w:lvl w:ilvl="8" w:tplc="40090005" w:tentative="1">
+      <w:start w:val="1"/>
+      <w:numFmt w:val="bullet"/>
+      <w:lvlText w:val=""/>
+      <w:lvlJc w:val="left"/>
+      <w:pPr>
+        <w:ind w:left="7200" w:hanging="360"/>
+      </w:pPr>
+      <w:rPr>
+        <w:rFonts w:ascii="Wingdings" w:hAnsi="Wingdings" w:hint="default"/>
+      </w:rPr>
+    </w:lvl>
+  </w:abstractNum>
+  <w:abstractNum w:abstractNumId="19" w15:restartNumberingAfterBreak="0">
+    <w:nsid w:val="50DE2E46"/>
+    <w:multiLevelType w:val="hybridMultilevel"/>
+    <w:tmpl w:val="BC4C2DBE"/>
+    <w:lvl w:ilvl="0" w:tplc="40090003">
+      <w:start w:val="1"/>
+      <w:numFmt w:val="bullet"/>
+      <w:lvlText w:val="o"/>
+      <w:lvlJc w:val="left"/>
+      <w:pPr>
+        <w:ind w:left="1440" w:hanging="360"/>
+      </w:pPr>
+      <w:rPr>
+        <w:rFonts w:ascii="Courier New" w:hAnsi="Courier New" w:cs="Courier New" w:hint="default"/>
+      </w:rPr>
+    </w:lvl>
+    <w:lvl w:ilvl="1" w:tplc="40090003" w:tentative="1">
+      <w:start w:val="1"/>
+      <w:numFmt w:val="bullet"/>
+      <w:lvlText w:val="o"/>
+      <w:lvlJc w:val="left"/>
+      <w:pPr>
+        <w:ind w:left="2160" w:hanging="360"/>
+      </w:pPr>
+      <w:rPr>
+        <w:rFonts w:ascii="Courier New" w:hAnsi="Courier New" w:cs="Courier New" w:hint="default"/>
+      </w:rPr>
+    </w:lvl>
+    <w:lvl w:ilvl="2" w:tplc="40090005" w:tentative="1">
+      <w:start w:val="1"/>
+      <w:numFmt w:val="bullet"/>
+      <w:lvlText w:val=""/>
+      <w:lvlJc w:val="left"/>
+      <w:pPr>
+        <w:ind w:left="2880" w:hanging="360"/>
+      </w:pPr>
+      <w:rPr>
+        <w:rFonts w:ascii="Wingdings" w:hAnsi="Wingdings" w:hint="default"/>
+      </w:rPr>
+    </w:lvl>
+    <w:lvl w:ilvl="3" w:tplc="40090001" w:tentative="1">
+      <w:start w:val="1"/>
+      <w:numFmt w:val="bullet"/>
+      <w:lvlText w:val=""/>
+      <w:lvlJc w:val="left"/>
+      <w:pPr>
+        <w:ind w:left="3600" w:hanging="360"/>
+      </w:pPr>
+      <w:rPr>
+        <w:rFonts w:ascii="Symbol" w:hAnsi="Symbol" w:hint="default"/>
+      </w:rPr>
+    </w:lvl>
+    <w:lvl w:ilvl="4" w:tplc="40090003" w:tentative="1">
+      <w:start w:val="1"/>
+      <w:numFmt w:val="bullet"/>
+      <w:lvlText w:val="o"/>
+      <w:lvlJc w:val="left"/>
+      <w:pPr>
+        <w:ind w:left="4320" w:hanging="360"/>
+      </w:pPr>
+      <w:rPr>
+        <w:rFonts w:ascii="Courier New" w:hAnsi="Courier New" w:cs="Courier New" w:hint="default"/>
+      </w:rPr>
+    </w:lvl>
+    <w:lvl w:ilvl="5" w:tplc="40090005" w:tentative="1">
+      <w:start w:val="1"/>
+      <w:numFmt w:val="bullet"/>
+      <w:lvlText w:val=""/>
+      <w:lvlJc w:val="left"/>
+      <w:pPr>
+        <w:ind w:left="5040" w:hanging="360"/>
+      </w:pPr>
+      <w:rPr>
+        <w:rFonts w:ascii="Wingdings" w:hAnsi="Wingdings" w:hint="default"/>
+      </w:rPr>
+    </w:lvl>
+    <w:lvl w:ilvl="6" w:tplc="40090001" w:tentative="1">
+      <w:start w:val="1"/>
+      <w:numFmt w:val="bullet"/>
+      <w:lvlText w:val=""/>
+      <w:lvlJc w:val="left"/>
+      <w:pPr>
+        <w:ind w:left="5760" w:hanging="360"/>
+      </w:pPr>
+      <w:rPr>
+        <w:rFonts w:ascii="Symbol" w:hAnsi="Symbol" w:hint="default"/>
+      </w:rPr>
+    </w:lvl>
+    <w:lvl w:ilvl="7" w:tplc="40090003" w:tentative="1">
+      <w:start w:val="1"/>
+      <w:numFmt w:val="bullet"/>
+      <w:lvlText w:val="o"/>
+      <w:lvlJc w:val="left"/>
+      <w:pPr>
+        <w:ind w:left="6480" w:hanging="360"/>
+      </w:pPr>
+      <w:rPr>
+        <w:rFonts w:ascii="Courier New" w:hAnsi="Courier New" w:cs="Courier New" w:hint="default"/>
+      </w:rPr>
+    </w:lvl>
+    <w:lvl w:ilvl="8" w:tplc="40090005" w:tentative="1">
+      <w:start w:val="1"/>
+      <w:numFmt w:val="bullet"/>
+      <w:lvlText w:val=""/>
+      <w:lvlJc w:val="left"/>
+      <w:pPr>
+        <w:ind w:left="7200" w:hanging="360"/>
+      </w:pPr>
+      <w:rPr>
+        <w:rFonts w:ascii="Wingdings" w:hAnsi="Wingdings" w:hint="default"/>
+      </w:rPr>
+    </w:lvl>
+  </w:abstractNum>
+  <w:abstractNum w:abstractNumId="20" w15:restartNumberingAfterBreak="0">
+    <w:nsid w:val="5C724BA5"/>
+    <w:multiLevelType w:val="hybridMultilevel"/>
+    <w:tmpl w:val="0A2EDD8C"/>
+    <w:lvl w:ilvl="0" w:tplc="40090003">
+      <w:start w:val="1"/>
+      <w:numFmt w:val="bullet"/>
+      <w:lvlText w:val="o"/>
+      <w:lvlJc w:val="left"/>
+      <w:pPr>
+        <w:ind w:left="1440" w:hanging="360"/>
+      </w:pPr>
+      <w:rPr>
+        <w:rFonts w:ascii="Courier New" w:hAnsi="Courier New" w:cs="Courier New" w:hint="default"/>
+      </w:rPr>
+    </w:lvl>
+    <w:lvl w:ilvl="1" w:tplc="40090003" w:tentative="1">
+      <w:start w:val="1"/>
+      <w:numFmt w:val="bullet"/>
+      <w:lvlText w:val="o"/>
+      <w:lvlJc w:val="left"/>
+      <w:pPr>
+        <w:ind w:left="2160" w:hanging="360"/>
+      </w:pPr>
+      <w:rPr>
+        <w:rFonts w:ascii="Courier New" w:hAnsi="Courier New" w:cs="Courier New" w:hint="default"/>
+      </w:rPr>
+    </w:lvl>
+    <w:lvl w:ilvl="2" w:tplc="40090005" w:tentative="1">
+      <w:start w:val="1"/>
+      <w:numFmt w:val="bullet"/>
+      <w:lvlText w:val=""/>
+      <w:lvlJc w:val="left"/>
+      <w:pPr>
+        <w:ind w:left="2880" w:hanging="360"/>
+      </w:pPr>
+      <w:rPr>
+        <w:rFonts w:ascii="Wingdings" w:hAnsi="Wingdings" w:hint="default"/>
+      </w:rPr>
+    </w:lvl>
+    <w:lvl w:ilvl="3" w:tplc="40090001" w:tentative="1">
+      <w:start w:val="1"/>
+      <w:numFmt w:val="bullet"/>
+      <w:lvlText w:val=""/>
+      <w:lvlJc w:val="left"/>
+      <w:pPr>
+        <w:ind w:left="3600" w:hanging="360"/>
+      </w:pPr>
+      <w:rPr>
+        <w:rFonts w:ascii="Symbol" w:hAnsi="Symbol" w:hint="default"/>
+      </w:rPr>
+    </w:lvl>
+    <w:lvl w:ilvl="4" w:tplc="40090003" w:tentative="1">
+      <w:start w:val="1"/>
+      <w:numFmt w:val="bullet"/>
+      <w:lvlText w:val="o"/>
+      <w:lvlJc w:val="left"/>
+      <w:pPr>
+        <w:ind w:left="4320" w:hanging="360"/>
+      </w:pPr>
+      <w:rPr>
+        <w:rFonts w:ascii="Courier New" w:hAnsi="Courier New" w:cs="Courier New" w:hint="default"/>
+      </w:rPr>
+    </w:lvl>
+    <w:lvl w:ilvl="5" w:tplc="40090005" w:tentative="1">
+      <w:start w:val="1"/>
+      <w:numFmt w:val="bullet"/>
+      <w:lvlText w:val=""/>
+      <w:lvlJc w:val="left"/>
+      <w:pPr>
+        <w:ind w:left="5040" w:hanging="360"/>
+      </w:pPr>
+      <w:rPr>
+        <w:rFonts w:ascii="Wingdings" w:hAnsi="Wingdings" w:hint="default"/>
+      </w:rPr>
+    </w:lvl>
+    <w:lvl w:ilvl="6" w:tplc="40090001" w:tentative="1">
+      <w:start w:val="1"/>
+      <w:numFmt w:val="bullet"/>
+      <w:lvlText w:val=""/>
+      <w:lvlJc w:val="left"/>
+      <w:pPr>
+        <w:ind w:left="5760" w:hanging="360"/>
+      </w:pPr>
+      <w:rPr>
+        <w:rFonts w:ascii="Symbol" w:hAnsi="Symbol" w:hint="default"/>
+      </w:rPr>
+    </w:lvl>
+    <w:lvl w:ilvl="7" w:tplc="40090003" w:tentative="1">
+      <w:start w:val="1"/>
+      <w:numFmt w:val="bullet"/>
+      <w:lvlText w:val="o"/>
+      <w:lvlJc w:val="left"/>
+      <w:pPr>
+        <w:ind w:left="6480" w:hanging="360"/>
+      </w:pPr>
+      <w:rPr>
+        <w:rFonts w:ascii="Courier New" w:hAnsi="Courier New" w:cs="Courier New" w:hint="default"/>
+      </w:rPr>
+    </w:lvl>
+    <w:lvl w:ilvl="8" w:tplc="40090005" w:tentative="1">
+      <w:start w:val="1"/>
+      <w:numFmt w:val="bullet"/>
+      <w:lvlText w:val=""/>
+      <w:lvlJc w:val="left"/>
+      <w:pPr>
+        <w:ind w:left="7200" w:hanging="360"/>
+      </w:pPr>
+      <w:rPr>
+        <w:rFonts w:ascii="Wingdings" w:hAnsi="Wingdings" w:hint="default"/>
+      </w:rPr>
+    </w:lvl>
+  </w:abstractNum>
+  <w:abstractNum w:abstractNumId="21" w15:restartNumberingAfterBreak="0">
+    <w:nsid w:val="68903BA0"/>
+    <w:multiLevelType w:val="hybridMultilevel"/>
+    <w:tmpl w:val="5A9228A8"/>
+    <w:lvl w:ilvl="0" w:tplc="40090003">
+      <w:start w:val="1"/>
+      <w:numFmt w:val="bullet"/>
+      <w:lvlText w:val="o"/>
+      <w:lvlJc w:val="left"/>
+      <w:pPr>
+        <w:ind w:left="1800" w:hanging="360"/>
+      </w:pPr>
+      <w:rPr>
+        <w:rFonts w:ascii="Courier New" w:hAnsi="Courier New" w:cs="Courier New" w:hint="default"/>
+      </w:rPr>
+    </w:lvl>
+    <w:lvl w:ilvl="1" w:tplc="40090003" w:tentative="1">
+      <w:start w:val="1"/>
+      <w:numFmt w:val="bullet"/>
+      <w:lvlText w:val="o"/>
+      <w:lvlJc w:val="left"/>
+      <w:pPr>
+        <w:ind w:left="2520" w:hanging="360"/>
+      </w:pPr>
+      <w:rPr>
+        <w:rFonts w:ascii="Courier New" w:hAnsi="Courier New" w:cs="Courier New" w:hint="default"/>
+      </w:rPr>
+    </w:lvl>
+    <w:lvl w:ilvl="2" w:tplc="40090005" w:tentative="1">
+      <w:start w:val="1"/>
+      <w:numFmt w:val="bullet"/>
+      <w:lvlText w:val=""/>
+      <w:lvlJc w:val="left"/>
+      <w:pPr>
+        <w:ind w:left="3240" w:hanging="360"/>
+      </w:pPr>
+      <w:rPr>
+        <w:rFonts w:ascii="Wingdings" w:hAnsi="Wingdings" w:hint="default"/>
+      </w:rPr>
+    </w:lvl>
+    <w:lvl w:ilvl="3" w:tplc="40090001" w:tentative="1">
+      <w:start w:val="1"/>
+      <w:numFmt w:val="bullet"/>
+      <w:lvlText w:val=""/>
+      <w:lvlJc w:val="left"/>
+      <w:pPr>
+        <w:ind w:left="3960" w:hanging="360"/>
+      </w:pPr>
+      <w:rPr>
+        <w:rFonts w:ascii="Symbol" w:hAnsi="Symbol" w:hint="default"/>
+      </w:rPr>
+    </w:lvl>
+    <w:lvl w:ilvl="4" w:tplc="40090003" w:tentative="1">
+      <w:start w:val="1"/>
+      <w:numFmt w:val="bullet"/>
+      <w:lvlText w:val="o"/>
+      <w:lvlJc w:val="left"/>
+      <w:pPr>
+        <w:ind w:left="4680" w:hanging="360"/>
+      </w:pPr>
+      <w:rPr>
+        <w:rFonts w:ascii="Courier New" w:hAnsi="Courier New" w:cs="Courier New" w:hint="default"/>
+      </w:rPr>
+    </w:lvl>
+    <w:lvl w:ilvl="5" w:tplc="40090005" w:tentative="1">
+      <w:start w:val="1"/>
+      <w:numFmt w:val="bullet"/>
+      <w:lvlText w:val=""/>
+      <w:lvlJc w:val="left"/>
+      <w:pPr>
+        <w:ind w:left="5400" w:hanging="360"/>
+      </w:pPr>
+      <w:rPr>
+        <w:rFonts w:ascii="Wingdings" w:hAnsi="Wingdings" w:hint="default"/>
+      </w:rPr>
+    </w:lvl>
+    <w:lvl w:ilvl="6" w:tplc="40090001" w:tentative="1">
+      <w:start w:val="1"/>
+      <w:numFmt w:val="bullet"/>
+      <w:lvlText w:val=""/>
+      <w:lvlJc w:val="left"/>
+      <w:pPr>
+        <w:ind w:left="6120" w:hanging="360"/>
+      </w:pPr>
+      <w:rPr>
+        <w:rFonts w:ascii="Symbol" w:hAnsi="Symbol" w:hint="default"/>
+      </w:rPr>
+    </w:lvl>
+    <w:lvl w:ilvl="7" w:tplc="40090003" w:tentative="1">
+      <w:start w:val="1"/>
+      <w:numFmt w:val="bullet"/>
+      <w:lvlText w:val="o"/>
+      <w:lvlJc w:val="left"/>
+      <w:pPr>
+        <w:ind w:left="6840" w:hanging="360"/>
+      </w:pPr>
+      <w:rPr>
+        <w:rFonts w:ascii="Courier New" w:hAnsi="Courier New" w:cs="Courier New" w:hint="default"/>
+      </w:rPr>
+    </w:lvl>
+    <w:lvl w:ilvl="8" w:tplc="40090005" w:tentative="1">
+      <w:start w:val="1"/>
+      <w:numFmt w:val="bullet"/>
+      <w:lvlText w:val=""/>
+      <w:lvlJc w:val="left"/>
+      <w:pPr>
+        <w:ind w:left="7560" w:hanging="360"/>
+      </w:pPr>
+      <w:rPr>
+        <w:rFonts w:ascii="Wingdings" w:hAnsi="Wingdings" w:hint="default"/>
+      </w:rPr>
+    </w:lvl>
+  </w:abstractNum>
+  <w:abstractNum w:abstractNumId="22" w15:restartNumberingAfterBreak="0">
+    <w:nsid w:val="72267A47"/>
+    <w:multiLevelType w:val="multilevel"/>
+    <w:tmpl w:val="9B7A32A6"/>
+    <w:lvl w:ilvl="0">
+      <w:start w:val="1"/>
+      <w:numFmt w:val="bullet"/>
+      <w:lvlText w:val=""/>
+      <w:lvlJc w:val="left"/>
+      <w:pPr>
+        <w:tabs>
+          <w:tab w:val="num" w:pos="720"/>
+        </w:tabs>
+        <w:ind w:left="720" w:hanging="360"/>
+      </w:pPr>
+      <w:rPr>
+        <w:rFonts w:ascii="Symbol" w:hAnsi="Symbol" w:hint="default"/>
+        <w:sz w:val="20"/>
+      </w:rPr>
+    </w:lvl>
+    <w:lvl w:ilvl="1" w:tentative="1">
+      <w:start w:val="1"/>
+      <w:numFmt w:val="bullet"/>
+      <w:lvlText w:val="o"/>
+      <w:lvlJc w:val="left"/>
+      <w:pPr>
+        <w:tabs>
+          <w:tab w:val="num" w:pos="1440"/>
+        </w:tabs>
+        <w:ind w:left="1440" w:hanging="360"/>
+      </w:pPr>
+      <w:rPr>
+        <w:rFonts w:ascii="Courier New" w:hAnsi="Courier New" w:hint="default"/>
+        <w:sz w:val="20"/>
+      </w:rPr>
+    </w:lvl>
+    <w:lvl w:ilvl="2" w:tentative="1">
+      <w:start w:val="1"/>
+      <w:numFmt w:val="bullet"/>
+      <w:lvlText w:val=""/>
+      <w:lvlJc w:val="left"/>
+      <w:pPr>
+        <w:tabs>
+          <w:tab w:val="num" w:pos="2160"/>
+        </w:tabs>
+        <w:ind w:left="2160" w:hanging="360"/>
+      </w:pPr>
+      <w:rPr>
+        <w:rFonts w:ascii="Wingdings" w:hAnsi="Wingdings" w:hint="default"/>
+        <w:sz w:val="20"/>
+      </w:rPr>
+    </w:lvl>
+    <w:lvl w:ilvl="3" w:tentative="1">
+      <w:start w:val="1"/>
+      <w:numFmt w:val="bullet"/>
+      <w:lvlText w:val=""/>
+      <w:lvlJc w:val="left"/>
+      <w:pPr>
+        <w:tabs>
+          <w:tab w:val="num" w:pos="2880"/>
+        </w:tabs>
+        <w:ind w:left="2880" w:hanging="360"/>
+      </w:pPr>
+      <w:rPr>
+        <w:rFonts w:ascii="Wingdings" w:hAnsi="Wingdings" w:hint="default"/>
+        <w:sz w:val="20"/>
+      </w:rPr>
+    </w:lvl>
+    <w:lvl w:ilvl="4" w:tentative="1">
+      <w:start w:val="1"/>
+      <w:numFmt w:val="bullet"/>
+      <w:lvlText w:val=""/>
+      <w:lvlJc w:val="left"/>
+      <w:pPr>
+        <w:tabs>
+          <w:tab w:val="num" w:pos="3600"/>
+        </w:tabs>
+        <w:ind w:left="3600" w:hanging="360"/>
+      </w:pPr>
+      <w:rPr>
+        <w:rFonts w:ascii="Wingdings" w:hAnsi="Wingdings" w:hint="default"/>
+        <w:sz w:val="20"/>
+      </w:rPr>
+    </w:lvl>
+    <w:lvl w:ilvl="5" w:tentative="1">
+      <w:start w:val="1"/>
+      <w:numFmt w:val="bullet"/>
+      <w:lvlText w:val=""/>
+      <w:lvlJc w:val="left"/>
+      <w:pPr>
+        <w:tabs>
+          <w:tab w:val="num" w:pos="4320"/>
+        </w:tabs>
+        <w:ind w:left="4320" w:hanging="360"/>
+      </w:pPr>
+      <w:rPr>
+        <w:rFonts w:ascii="Wingdings" w:hAnsi="Wingdings" w:hint="default"/>
+        <w:sz w:val="20"/>
+      </w:rPr>
+    </w:lvl>
+    <w:lvl w:ilvl="6" w:tentative="1">
+      <w:start w:val="1"/>
+      <w:numFmt w:val="bullet"/>
+      <w:lvlText w:val=""/>
+      <w:lvlJc w:val="left"/>
+      <w:pPr>
+        <w:tabs>
+          <w:tab w:val="num" w:pos="5040"/>
+        </w:tabs>
+        <w:ind w:left="5040" w:hanging="360"/>
+      </w:pPr>
+      <w:rPr>
+        <w:rFonts w:ascii="Wingdings" w:hAnsi="Wingdings" w:hint="default"/>
+        <w:sz w:val="20"/>
+      </w:rPr>
+    </w:lvl>
+    <w:lvl w:ilvl="7" w:tentative="1">
+      <w:start w:val="1"/>
+      <w:numFmt w:val="bullet"/>
+      <w:lvlText w:val=""/>
+      <w:lvlJc w:val="left"/>
+      <w:pPr>
+        <w:tabs>
+          <w:tab w:val="num" w:pos="5760"/>
+        </w:tabs>
+        <w:ind w:left="5760" w:hanging="360"/>
+      </w:pPr>
+      <w:rPr>
+        <w:rFonts w:ascii="Wingdings" w:hAnsi="Wingdings" w:hint="default"/>
+        <w:sz w:val="20"/>
+      </w:rPr>
+    </w:lvl>
+    <w:lvl w:ilvl="8" w:tentative="1">
+      <w:start w:val="1"/>
+      <w:numFmt w:val="bullet"/>
+      <w:lvlText w:val=""/>
+      <w:lvlJc w:val="left"/>
+      <w:pPr>
+        <w:tabs>
+          <w:tab w:val="num" w:pos="6480"/>
+        </w:tabs>
+        <w:ind w:left="6480" w:hanging="360"/>
+      </w:pPr>
+      <w:rPr>
+        <w:rFonts w:ascii="Wingdings" w:hAnsi="Wingdings" w:hint="default"/>
+        <w:sz w:val="20"/>
+      </w:rPr>
+    </w:lvl>
+  </w:abstractNum>
+  <w:abstractNum w:abstractNumId="23" w15:restartNumberingAfterBreak="0">
     <w:nsid w:val="77041AED"/>
     <w:multiLevelType w:val="hybridMultilevel"/>
     <w:tmpl w:val="6F76A40E"/>
@@ -3904,7 +5685,7 @@
         <w:rFonts w:ascii="Courier New" w:hAnsi="Courier New" w:cs="Courier New" w:hint="default"/>
       </w:rPr>
     </w:lvl>
-    <w:lvl w:ilvl="1" w:tplc="40090003" w:tentative="1">
+    <w:lvl w:ilvl="1" w:tplc="40090003">
       <w:start w:val="1"/>
       <w:numFmt w:val="bullet"/>
       <w:lvlText w:val="o"/>
@@ -4001,7 +5782,7 @@
       </w:rPr>
     </w:lvl>
   </w:abstractNum>
-  <w:abstractNum w:abstractNumId="17" w15:restartNumberingAfterBreak="0">
+  <w:abstractNum w:abstractNumId="24" w15:restartNumberingAfterBreak="0">
     <w:nsid w:val="79213E39"/>
     <w:multiLevelType w:val="hybridMultilevel"/>
     <w:tmpl w:val="87E847B8"/>
@@ -4114,10 +5895,10 @@
       </w:rPr>
     </w:lvl>
   </w:abstractNum>
-  <w:abstractNum w:abstractNumId="18" w15:restartNumberingAfterBreak="0">
+  <w:abstractNum w:abstractNumId="25" w15:restartNumberingAfterBreak="0">
     <w:nsid w:val="7D683F9F"/>
     <w:multiLevelType w:val="hybridMultilevel"/>
-    <w:tmpl w:val="72743C3E"/>
+    <w:tmpl w:val="9BA23660"/>
     <w:lvl w:ilvl="0" w:tplc="40090003">
       <w:start w:val="1"/>
       <w:numFmt w:val="bullet"/>
@@ -4227,7 +6008,7 @@
       </w:rPr>
     </w:lvl>
   </w:abstractNum>
-  <w:abstractNum w:abstractNumId="19" w15:restartNumberingAfterBreak="0">
+  <w:abstractNum w:abstractNumId="26" w15:restartNumberingAfterBreak="0">
     <w:nsid w:val="7F0004C9"/>
     <w:multiLevelType w:val="hybridMultilevel"/>
     <w:tmpl w:val="828CBB9A"/>
@@ -4368,37 +6149,58 @@
     <w:abstractNumId w:val="0"/>
   </w:num>
   <w:num w:numId="10" w16cid:durableId="1716391125">
-    <w:abstractNumId w:val="19"/>
+    <w:abstractNumId w:val="26"/>
   </w:num>
   <w:num w:numId="11" w16cid:durableId="1583295348">
+    <w:abstractNumId w:val="14"/>
+  </w:num>
+  <w:num w:numId="12" w16cid:durableId="767240579">
+    <w:abstractNumId w:val="17"/>
+  </w:num>
+  <w:num w:numId="13" w16cid:durableId="1550413797">
+    <w:abstractNumId w:val="24"/>
+  </w:num>
+  <w:num w:numId="14" w16cid:durableId="331683424">
+    <w:abstractNumId w:val="11"/>
+  </w:num>
+  <w:num w:numId="15" w16cid:durableId="1707833338">
     <w:abstractNumId w:val="13"/>
   </w:num>
-  <w:num w:numId="12" w16cid:durableId="767240579">
-    <w:abstractNumId w:val="15"/>
-  </w:num>
-  <w:num w:numId="13" w16cid:durableId="1550413797">
-    <w:abstractNumId w:val="17"/>
-  </w:num>
-  <w:num w:numId="14" w16cid:durableId="331683424">
-    <w:abstractNumId w:val="10"/>
-  </w:num>
-  <w:num w:numId="15" w16cid:durableId="1707833338">
+  <w:num w:numId="16" w16cid:durableId="102045010">
     <w:abstractNumId w:val="12"/>
-  </w:num>
-  <w:num w:numId="16" w16cid:durableId="102045010">
-    <w:abstractNumId w:val="11"/>
   </w:num>
   <w:num w:numId="17" w16cid:durableId="387386515">
     <w:abstractNumId w:val="9"/>
   </w:num>
   <w:num w:numId="18" w16cid:durableId="1005668106">
+    <w:abstractNumId w:val="25"/>
+  </w:num>
+  <w:num w:numId="19" w16cid:durableId="393554495">
+    <w:abstractNumId w:val="23"/>
+  </w:num>
+  <w:num w:numId="20" w16cid:durableId="1747655065">
+    <w:abstractNumId w:val="15"/>
+  </w:num>
+  <w:num w:numId="21" w16cid:durableId="1051882706">
+    <w:abstractNumId w:val="22"/>
+  </w:num>
+  <w:num w:numId="22" w16cid:durableId="390813366">
+    <w:abstractNumId w:val="16"/>
+  </w:num>
+  <w:num w:numId="23" w16cid:durableId="766078728">
+    <w:abstractNumId w:val="21"/>
+  </w:num>
+  <w:num w:numId="24" w16cid:durableId="141584089">
+    <w:abstractNumId w:val="19"/>
+  </w:num>
+  <w:num w:numId="25" w16cid:durableId="1511991298">
+    <w:abstractNumId w:val="10"/>
+  </w:num>
+  <w:num w:numId="26" w16cid:durableId="2063753170">
     <w:abstractNumId w:val="18"/>
   </w:num>
-  <w:num w:numId="19" w16cid:durableId="393554495">
-    <w:abstractNumId w:val="16"/>
-  </w:num>
-  <w:num w:numId="20" w16cid:durableId="1747655065">
-    <w:abstractNumId w:val="14"/>
+  <w:num w:numId="27" w16cid:durableId="374161317">
+    <w:abstractNumId w:val="20"/>
   </w:num>
 </w:numbering>
 </file>
@@ -4792,7 +6594,7 @@
   <w:style w:type="paragraph" w:default="1" w:styleId="Normal">
     <w:name w:val="Normal"/>
     <w:qFormat/>
-    <w:rsid w:val="00FC693F"/>
+    <w:rsid w:val="007207A0"/>
     <w:rPr>
       <w:rFonts w:ascii="Calibri" w:hAnsi="Calibri"/>
     </w:rPr>

</xml_diff>